<commit_message>
move supp figure into main manuscript
</commit_message>
<xml_diff>
--- a/_manuscript/index.docx
+++ b/_manuscript/index.docx
@@ -1862,7 +1862,127 @@
         <w:rPr>
           <w:rStyle w:val="NormalTok"/>
         </w:rPr>
-        <w:t xml:space="preserve"> </w:t>
+        <w:t xml:space="preserve">sigma[</w:t>
+      </w:r>
+      <w:r>
+        <w:rPr>
+          <w:rStyle w:val="DecValTok"/>
+        </w:rPr>
+        <w:t xml:space="preserve">2</w:t>
+      </w:r>
+      <w:r>
+        <w:rPr>
+          <w:rStyle w:val="SpecialCharTok"/>
+        </w:rPr>
+        <w:t xml:space="preserve">:</w:t>
+      </w:r>
+      <w:r>
+        <w:rPr>
+          <w:rStyle w:val="NormalTok"/>
+        </w:rPr>
+        <w:t xml:space="preserve">(</w:t>
+      </w:r>
+      <w:r>
+        <w:rPr>
+          <w:rStyle w:val="FunctionTok"/>
+        </w:rPr>
+        <w:t xml:space="preserve">nrow</w:t>
+      </w:r>
+      <w:r>
+        <w:rPr>
+          <w:rStyle w:val="NormalTok"/>
+        </w:rPr>
+        <w:t xml:space="preserve">(corr_matrix) </w:t>
+      </w:r>
+      <w:r>
+        <w:rPr>
+          <w:rStyle w:val="SpecialCharTok"/>
+        </w:rPr>
+        <w:t xml:space="preserve">+</w:t>
+      </w:r>
+      <w:r>
+        <w:rPr>
+          <w:rStyle w:val="NormalTok"/>
+        </w:rPr>
+        <w:t xml:space="preserve"> </w:t>
+      </w:r>
+      <w:r>
+        <w:rPr>
+          <w:rStyle w:val="DecValTok"/>
+        </w:rPr>
+        <w:t xml:space="preserve">1</w:t>
+      </w:r>
+      <w:r>
+        <w:rPr>
+          <w:rStyle w:val="NormalTok"/>
+        </w:rPr>
+        <w:t xml:space="preserve">), </w:t>
+      </w:r>
+      <w:r>
+        <w:rPr>
+          <w:rStyle w:val="DecValTok"/>
+        </w:rPr>
+        <w:t xml:space="preserve">2</w:t>
+      </w:r>
+      <w:r>
+        <w:rPr>
+          <w:rStyle w:val="SpecialCharTok"/>
+        </w:rPr>
+        <w:t xml:space="preserve">:</w:t>
+      </w:r>
+      <w:r>
+        <w:rPr>
+          <w:rStyle w:val="NormalTok"/>
+        </w:rPr>
+        <w:t xml:space="preserve">(</w:t>
+      </w:r>
+      <w:r>
+        <w:rPr>
+          <w:rStyle w:val="FunctionTok"/>
+        </w:rPr>
+        <w:t xml:space="preserve">ncol</w:t>
+      </w:r>
+      <w:r>
+        <w:rPr>
+          <w:rStyle w:val="NormalTok"/>
+        </w:rPr>
+        <w:t xml:space="preserve">(corr_matrix) </w:t>
+      </w:r>
+      <w:r>
+        <w:rPr>
+          <w:rStyle w:val="SpecialCharTok"/>
+        </w:rPr>
+        <w:t xml:space="preserve">+</w:t>
+      </w:r>
+      <w:r>
+        <w:rPr>
+          <w:rStyle w:val="NormalTok"/>
+        </w:rPr>
+        <w:t xml:space="preserve"> </w:t>
+      </w:r>
+      <w:r>
+        <w:rPr>
+          <w:rStyle w:val="DecValTok"/>
+        </w:rPr>
+        <w:t xml:space="preserve">1</w:t>
+      </w:r>
+      <w:r>
+        <w:rPr>
+          <w:rStyle w:val="NormalTok"/>
+        </w:rPr>
+        <w:t xml:space="preserve">)] </w:t>
+      </w:r>
+      <w:r>
+        <w:rPr>
+          <w:rStyle w:val="OtherTok"/>
+        </w:rPr>
+        <w:t xml:space="preserve">&lt;-</w:t>
+      </w:r>
+      <w:r>
+        <w:rPr>
+          <w:rStyle w:val="NormalTok"/>
+        </w:rPr>
+        <w:t xml:space="preserve"> corr_matrix</w:t>
       </w:r>
       <w:r>
         <w:br/>
@@ -1877,6 +1997,18 @@
         <w:rPr>
           <w:rStyle w:val="DecValTok"/>
         </w:rPr>
+        <w:t xml:space="preserve">1</w:t>
+      </w:r>
+      <w:r>
+        <w:rPr>
+          <w:rStyle w:val="NormalTok"/>
+        </w:rPr>
+        <w:t xml:space="preserve">, </w:t>
+      </w:r>
+      <w:r>
+        <w:rPr>
+          <w:rStyle w:val="DecValTok"/>
+        </w:rPr>
         <w:t xml:space="preserve">2</w:t>
       </w:r>
       <w:r>
@@ -1889,31 +2021,532 @@
         <w:rPr>
           <w:rStyle w:val="NormalTok"/>
         </w:rPr>
+        <w:t xml:space="preserve">(n_good_covs </w:t>
+      </w:r>
+      <w:r>
+        <w:rPr>
+          <w:rStyle w:val="SpecialCharTok"/>
+        </w:rPr>
+        <w:t xml:space="preserve">+</w:t>
+      </w:r>
+      <w:r>
+        <w:rPr>
+          <w:rStyle w:val="NormalTok"/>
+        </w:rPr>
+        <w:t xml:space="preserve"> </w:t>
+      </w:r>
+      <w:r>
+        <w:rPr>
+          <w:rStyle w:val="DecValTok"/>
+        </w:rPr>
+        <w:t xml:space="preserve">1</w:t>
+      </w:r>
+      <w:r>
+        <w:rPr>
+          <w:rStyle w:val="NormalTok"/>
+        </w:rPr>
+        <w:t xml:space="preserve">)] </w:t>
+      </w:r>
+      <w:r>
+        <w:rPr>
+          <w:rStyle w:val="OtherTok"/>
+        </w:rPr>
+        <w:t xml:space="preserve">&lt;-</w:t>
+      </w:r>
+      <w:r>
+        <w:rPr>
+          <w:rStyle w:val="NormalTok"/>
+        </w:rPr>
+        <w:t xml:space="preserve"> </w:t>
+      </w:r>
+      <w:r>
+        <w:rPr>
+          <w:rStyle w:val="FunctionTok"/>
+        </w:rPr>
+        <w:t xml:space="preserve">rep</w:t>
+      </w:r>
+      <w:r>
+        <w:rPr>
+          <w:rStyle w:val="NormalTok"/>
+        </w:rPr>
+        <w:t xml:space="preserve">(r_ycov, n_good_covs)</w:t>
+      </w:r>
+      <w:r>
+        <w:br/>
+      </w:r>
+      <w:r>
+        <w:rPr>
+          <w:rStyle w:val="NormalTok"/>
+        </w:rPr>
+        <w:t xml:space="preserve">sigma[</w:t>
+      </w:r>
+      <w:r>
+        <w:rPr>
+          <w:rStyle w:val="DecValTok"/>
+        </w:rPr>
+        <w:t xml:space="preserve">2</w:t>
+      </w:r>
+      <w:r>
+        <w:rPr>
+          <w:rStyle w:val="SpecialCharTok"/>
+        </w:rPr>
+        <w:t xml:space="preserve">:</w:t>
+      </w:r>
+      <w:r>
+        <w:rPr>
+          <w:rStyle w:val="NormalTok"/>
+        </w:rPr>
+        <w:t xml:space="preserve">(n_good_covs </w:t>
+      </w:r>
+      <w:r>
+        <w:rPr>
+          <w:rStyle w:val="SpecialCharTok"/>
+        </w:rPr>
+        <w:t xml:space="preserve">+</w:t>
+      </w:r>
+      <w:r>
+        <w:rPr>
+          <w:rStyle w:val="NormalTok"/>
+        </w:rPr>
+        <w:t xml:space="preserve"> </w:t>
+      </w:r>
+      <w:r>
+        <w:rPr>
+          <w:rStyle w:val="DecValTok"/>
+        </w:rPr>
+        <w:t xml:space="preserve">1</w:t>
+      </w:r>
+      <w:r>
+        <w:rPr>
+          <w:rStyle w:val="NormalTok"/>
+        </w:rPr>
+        <w:t xml:space="preserve">), </w:t>
+      </w:r>
+      <w:r>
+        <w:rPr>
+          <w:rStyle w:val="DecValTok"/>
+        </w:rPr>
+        <w:t xml:space="preserve">1</w:t>
+      </w:r>
+      <w:r>
+        <w:rPr>
+          <w:rStyle w:val="NormalTok"/>
+        </w:rPr>
+        <w:t xml:space="preserve">] </w:t>
+      </w:r>
+      <w:r>
+        <w:rPr>
+          <w:rStyle w:val="OtherTok"/>
+        </w:rPr>
+        <w:t xml:space="preserve">&lt;-</w:t>
+      </w:r>
+      <w:r>
+        <w:rPr>
+          <w:rStyle w:val="NormalTok"/>
+        </w:rPr>
+        <w:t xml:space="preserve"> </w:t>
+      </w:r>
+      <w:r>
+        <w:rPr>
+          <w:rStyle w:val="FunctionTok"/>
+        </w:rPr>
+        <w:t xml:space="preserve">rep</w:t>
+      </w:r>
+      <w:r>
+        <w:rPr>
+          <w:rStyle w:val="NormalTok"/>
+        </w:rPr>
+        <w:t xml:space="preserve">(r_ycov, n_good_covs)</w:t>
+      </w:r>
+      <w:r>
+        <w:br/>
+      </w:r>
+      <w:r>
+        <w:rPr>
+          <w:rStyle w:val="NormalTok"/>
+        </w:rPr>
+        <w:t xml:space="preserve">  </w:t>
+      </w:r>
+      <w:r>
+        <w:br/>
+      </w:r>
+      <w:r>
+        <w:rPr>
+          <w:rStyle w:val="NormalTok"/>
+        </w:rPr>
+        <w:t xml:space="preserve">ycovs </w:t>
+      </w:r>
+      <w:r>
+        <w:rPr>
+          <w:rStyle w:val="OtherTok"/>
+        </w:rPr>
+        <w:t xml:space="preserve">&lt;-</w:t>
+      </w:r>
+      <w:r>
+        <w:rPr>
+          <w:rStyle w:val="NormalTok"/>
+        </w:rPr>
+        <w:t xml:space="preserve"> MASS</w:t>
+      </w:r>
+      <w:r>
+        <w:rPr>
+          <w:rStyle w:val="SpecialCharTok"/>
+        </w:rPr>
+        <w:t xml:space="preserve">::</w:t>
+      </w:r>
+      <w:r>
+        <w:rPr>
+          <w:rStyle w:val="FunctionTok"/>
+        </w:rPr>
+        <w:t xml:space="preserve">mvrnorm</w:t>
+      </w:r>
+      <w:r>
+        <w:rPr>
+          <w:rStyle w:val="NormalTok"/>
+        </w:rPr>
+        <w:t xml:space="preserve">(n_obs, </w:t>
+      </w:r>
+      <w:r>
+        <w:rPr>
+          <w:rStyle w:val="AttributeTok"/>
+        </w:rPr>
+        <w:t xml:space="preserve">mu =</w:t>
+      </w:r>
+      <w:r>
+        <w:rPr>
+          <w:rStyle w:val="NormalTok"/>
+        </w:rPr>
+        <w:t xml:space="preserve"> </w:t>
+      </w:r>
+      <w:r>
+        <w:rPr>
+          <w:rStyle w:val="FunctionTok"/>
+        </w:rPr>
+        <w:t xml:space="preserve">rep</w:t>
+      </w:r>
+      <w:r>
+        <w:rPr>
+          <w:rStyle w:val="NormalTok"/>
+        </w:rPr>
         <w:t xml:space="preserve">(</w:t>
       </w:r>
       <w:r>
         <w:rPr>
+          <w:rStyle w:val="DecValTok"/>
+        </w:rPr>
+        <w:t xml:space="preserve">0</w:t>
+      </w:r>
+      <w:r>
+        <w:rPr>
+          <w:rStyle w:val="NormalTok"/>
+        </w:rPr>
+        <w:t xml:space="preserve">, n_covs </w:t>
+      </w:r>
+      <w:r>
+        <w:rPr>
+          <w:rStyle w:val="SpecialCharTok"/>
+        </w:rPr>
+        <w:t xml:space="preserve">+</w:t>
+      </w:r>
+      <w:r>
+        <w:rPr>
+          <w:rStyle w:val="NormalTok"/>
+        </w:rPr>
+        <w:t xml:space="preserve"> </w:t>
+      </w:r>
+      <w:r>
+        <w:rPr>
+          <w:rStyle w:val="DecValTok"/>
+        </w:rPr>
+        <w:t xml:space="preserve">1</w:t>
+      </w:r>
+      <w:r>
+        <w:rPr>
+          <w:rStyle w:val="NormalTok"/>
+        </w:rPr>
+        <w:t xml:space="preserve">), </w:t>
+      </w:r>
+      <w:r>
+        <w:rPr>
+          <w:rStyle w:val="AttributeTok"/>
+        </w:rPr>
+        <w:t xml:space="preserve">Sigma =</w:t>
+      </w:r>
+      <w:r>
+        <w:rPr>
+          <w:rStyle w:val="NormalTok"/>
+        </w:rPr>
+        <w:t xml:space="preserve"> sigma)</w:t>
+      </w:r>
+      <w:r>
+        <w:br/>
+      </w:r>
+      <w:r>
+        <w:rPr>
+          <w:rStyle w:val="NormalTok"/>
+        </w:rPr>
+        <w:t xml:space="preserve">y </w:t>
+      </w:r>
+      <w:r>
+        <w:rPr>
+          <w:rStyle w:val="OtherTok"/>
+        </w:rPr>
+        <w:t xml:space="preserve">&lt;-</w:t>
+      </w:r>
+      <w:r>
+        <w:rPr>
+          <w:rStyle w:val="NormalTok"/>
+        </w:rPr>
+        <w:t xml:space="preserve"> ycovs[, </w:t>
+      </w:r>
+      <w:r>
+        <w:rPr>
+          <w:rStyle w:val="DecValTok"/>
+        </w:rPr>
+        <w:t xml:space="preserve">1</w:t>
+      </w:r>
+      <w:r>
+        <w:rPr>
+          <w:rStyle w:val="NormalTok"/>
+        </w:rPr>
+        <w:t xml:space="preserve">]</w:t>
+      </w:r>
+      <w:r>
+        <w:br/>
+      </w:r>
+      <w:r>
+        <w:rPr>
+          <w:rStyle w:val="NormalTok"/>
+        </w:rPr>
+        <w:t xml:space="preserve">covs </w:t>
+      </w:r>
+      <w:r>
+        <w:rPr>
+          <w:rStyle w:val="OtherTok"/>
+        </w:rPr>
+        <w:t xml:space="preserve">&lt;-</w:t>
+      </w:r>
+      <w:r>
+        <w:rPr>
+          <w:rStyle w:val="NormalTok"/>
+        </w:rPr>
+        <w:t xml:space="preserve"> ycovs[, </w:t>
+      </w:r>
+      <w:r>
+        <w:rPr>
+          <w:rStyle w:val="SpecialCharTok"/>
+        </w:rPr>
+        <w:t xml:space="preserve">-</w:t>
+      </w:r>
+      <w:r>
+        <w:rPr>
+          <w:rStyle w:val="DecValTok"/>
+        </w:rPr>
+        <w:t xml:space="preserve">1</w:t>
+      </w:r>
+      <w:r>
+        <w:rPr>
+          <w:rStyle w:val="NormalTok"/>
+        </w:rPr>
+        <w:t xml:space="preserve">]</w:t>
+      </w:r>
+      <w:r>
+        <w:br/>
+      </w:r>
+      <w:r>
+        <w:rPr>
+          <w:rStyle w:val="NormalTok"/>
+        </w:rPr>
+        <w:t xml:space="preserve">  </w:t>
+      </w:r>
+      <w:r>
+        <w:br/>
+      </w:r>
+      <w:r>
+        <w:rPr>
+          <w:rStyle w:val="NormalTok"/>
+        </w:rPr>
+        <w:t xml:space="preserve">y </w:t>
+      </w:r>
+      <w:r>
+        <w:rPr>
+          <w:rStyle w:val="OtherTok"/>
+        </w:rPr>
+        <w:t xml:space="preserve">&lt;-</w:t>
+      </w:r>
+      <w:r>
+        <w:rPr>
+          <w:rStyle w:val="NormalTok"/>
+        </w:rPr>
+        <w:t xml:space="preserve"> y </w:t>
+      </w:r>
+      <w:r>
+        <w:rPr>
+          <w:rStyle w:val="SpecialCharTok"/>
+        </w:rPr>
+        <w:t xml:space="preserve">+</w:t>
+      </w:r>
+      <w:r>
+        <w:rPr>
+          <w:rStyle w:val="NormalTok"/>
+        </w:rPr>
+        <w:t xml:space="preserve"> b_x </w:t>
+      </w:r>
+      <w:r>
+        <w:rPr>
+          <w:rStyle w:val="SpecialCharTok"/>
+        </w:rPr>
+        <w:t xml:space="preserve">*</w:t>
+      </w:r>
+      <w:r>
+        <w:rPr>
+          <w:rStyle w:val="NormalTok"/>
+        </w:rPr>
+        <w:t xml:space="preserve"> x</w:t>
+      </w:r>
+      <w:r>
+        <w:br/>
+      </w:r>
+      <w:r>
+        <w:rPr>
+          <w:rStyle w:val="NormalTok"/>
+        </w:rPr>
+        <w:t xml:space="preserve"> </w:t>
+      </w:r>
+      <w:r>
+        <w:br/>
+      </w:r>
+      <w:r>
+        <w:rPr>
+          <w:rStyle w:val="NormalTok"/>
+        </w:rPr>
+        <w:t xml:space="preserve">covs </w:t>
+      </w:r>
+      <w:r>
+        <w:rPr>
+          <w:rStyle w:val="OtherTok"/>
+        </w:rPr>
+        <w:t xml:space="preserve">&lt;-</w:t>
+      </w:r>
+      <w:r>
+        <w:rPr>
+          <w:rStyle w:val="NormalTok"/>
+        </w:rPr>
+        <w:t xml:space="preserve"> covs </w:t>
+      </w:r>
+      <w:r>
+        <w:rPr>
+          <w:rStyle w:val="SpecialCharTok"/>
+        </w:rPr>
+        <w:t xml:space="preserve">|&gt;</w:t>
+      </w:r>
+      <w:r>
+        <w:br/>
+      </w:r>
+      <w:r>
+        <w:rPr>
+          <w:rStyle w:val="NormalTok"/>
+        </w:rPr>
+        <w:t xml:space="preserve">    tibble</w:t>
+      </w:r>
+      <w:r>
+        <w:rPr>
+          <w:rStyle w:val="SpecialCharTok"/>
+        </w:rPr>
+        <w:t xml:space="preserve">::</w:t>
+      </w:r>
+      <w:r>
+        <w:rPr>
           <w:rStyle w:val="FunctionTok"/>
         </w:rPr>
-        <w:t xml:space="preserve">nrow</w:t>
-      </w:r>
-      <w:r>
-        <w:rPr>
-          <w:rStyle w:val="NormalTok"/>
-        </w:rPr>
-        <w:t xml:space="preserve">(corr_matrix) </w:t>
+        <w:t xml:space="preserve">as_tibble</w:t>
+      </w:r>
+      <w:r>
+        <w:rPr>
+          <w:rStyle w:val="NormalTok"/>
+        </w:rPr>
+        <w:t xml:space="preserve">(</w:t>
+      </w:r>
+      <w:r>
+        <w:rPr>
+          <w:rStyle w:val="AttributeTok"/>
+        </w:rPr>
+        <w:t xml:space="preserve">.name_repair =</w:t>
+      </w:r>
+      <w:r>
+        <w:rPr>
+          <w:rStyle w:val="NormalTok"/>
+        </w:rPr>
+        <w:t xml:space="preserve"> </w:t>
+      </w:r>
+      <w:r>
+        <w:rPr>
+          <w:rStyle w:val="StringTok"/>
+        </w:rPr>
+        <w:t xml:space="preserve">"minimal"</w:t>
+      </w:r>
+      <w:r>
+        <w:rPr>
+          <w:rStyle w:val="NormalTok"/>
+        </w:rPr>
+        <w:t xml:space="preserve">)</w:t>
+      </w:r>
+      <w:r>
+        <w:br/>
+      </w:r>
+      <w:r>
+        <w:rPr>
+          <w:rStyle w:val="FunctionTok"/>
+        </w:rPr>
+        <w:t xml:space="preserve">names</w:t>
+      </w:r>
+      <w:r>
+        <w:rPr>
+          <w:rStyle w:val="NormalTok"/>
+        </w:rPr>
+        <w:t xml:space="preserve">(covs) </w:t>
+      </w:r>
+      <w:r>
+        <w:rPr>
+          <w:rStyle w:val="OtherTok"/>
+        </w:rPr>
+        <w:t xml:space="preserve">&lt;-</w:t>
+      </w:r>
+      <w:r>
+        <w:rPr>
+          <w:rStyle w:val="NormalTok"/>
+        </w:rPr>
+        <w:t xml:space="preserve"> stringr</w:t>
       </w:r>
       <w:r>
         <w:rPr>
           <w:rStyle w:val="SpecialCharTok"/>
         </w:rPr>
-        <w:t xml:space="preserve">+</w:t>
-      </w:r>
-      <w:r>
-        <w:rPr>
-          <w:rStyle w:val="NormalTok"/>
-        </w:rPr>
-        <w:t xml:space="preserve"> </w:t>
+        <w:t xml:space="preserve">::</w:t>
+      </w:r>
+      <w:r>
+        <w:rPr>
+          <w:rStyle w:val="FunctionTok"/>
+        </w:rPr>
+        <w:t xml:space="preserve">str_c</w:t>
+      </w:r>
+      <w:r>
+        <w:rPr>
+          <w:rStyle w:val="NormalTok"/>
+        </w:rPr>
+        <w:t xml:space="preserve">(</w:t>
+      </w:r>
+      <w:r>
+        <w:rPr>
+          <w:rStyle w:val="StringTok"/>
+        </w:rPr>
+        <w:t xml:space="preserve">"c"</w:t>
+      </w:r>
+      <w:r>
+        <w:rPr>
+          <w:rStyle w:val="NormalTok"/>
+        </w:rPr>
+        <w:t xml:space="preserve">, </w:t>
       </w:r>
       <w:r>
         <w:rPr>
@@ -1923,18 +2556,6 @@
       </w:r>
       <w:r>
         <w:rPr>
-          <w:rStyle w:val="NormalTok"/>
-        </w:rPr>
-        <w:t xml:space="preserve">), </w:t>
-      </w:r>
-      <w:r>
-        <w:rPr>
-          <w:rStyle w:val="DecValTok"/>
-        </w:rPr>
-        <w:t xml:space="preserve">2</w:t>
-      </w:r>
-      <w:r>
-        <w:rPr>
           <w:rStyle w:val="SpecialCharTok"/>
         </w:rPr>
         <w:t xml:space="preserve">:</w:t>
@@ -1943,750 +2564,102 @@
         <w:rPr>
           <w:rStyle w:val="NormalTok"/>
         </w:rPr>
+        <w:t xml:space="preserve">n_covs)</w:t>
+      </w:r>
+      <w:r>
+        <w:br/>
+      </w:r>
+      <w:r>
+        <w:rPr>
+          <w:rStyle w:val="NormalTok"/>
+        </w:rPr>
+        <w:t xml:space="preserve">df </w:t>
+      </w:r>
+      <w:r>
+        <w:rPr>
+          <w:rStyle w:val="OtherTok"/>
+        </w:rPr>
+        <w:t xml:space="preserve">&lt;-</w:t>
+      </w:r>
+      <w:r>
+        <w:rPr>
+          <w:rStyle w:val="NormalTok"/>
+        </w:rPr>
+        <w:t xml:space="preserve"> tibble</w:t>
+      </w:r>
+      <w:r>
+        <w:rPr>
+          <w:rStyle w:val="SpecialCharTok"/>
+        </w:rPr>
+        <w:t xml:space="preserve">::</w:t>
+      </w:r>
+      <w:r>
+        <w:rPr>
+          <w:rStyle w:val="FunctionTok"/>
+        </w:rPr>
+        <w:t xml:space="preserve">tibble</w:t>
+      </w:r>
+      <w:r>
+        <w:rPr>
+          <w:rStyle w:val="NormalTok"/>
+        </w:rPr>
         <w:t xml:space="preserve">(</w:t>
       </w:r>
       <w:r>
         <w:rPr>
+          <w:rStyle w:val="AttributeTok"/>
+        </w:rPr>
+        <w:t xml:space="preserve">y =</w:t>
+      </w:r>
+      <w:r>
+        <w:rPr>
+          <w:rStyle w:val="NormalTok"/>
+        </w:rPr>
+        <w:t xml:space="preserve"> y, </w:t>
+      </w:r>
+      <w:r>
+        <w:rPr>
+          <w:rStyle w:val="AttributeTok"/>
+        </w:rPr>
+        <w:t xml:space="preserve">x =</w:t>
+      </w:r>
+      <w:r>
+        <w:rPr>
+          <w:rStyle w:val="NormalTok"/>
+        </w:rPr>
+        <w:t xml:space="preserve"> x) </w:t>
+      </w:r>
+      <w:r>
+        <w:rPr>
+          <w:rStyle w:val="SpecialCharTok"/>
+        </w:rPr>
+        <w:t xml:space="preserve">|&gt;</w:t>
+      </w:r>
+      <w:r>
+        <w:rPr>
+          <w:rStyle w:val="NormalTok"/>
+        </w:rPr>
+        <w:t xml:space="preserve"> </w:t>
+      </w:r>
+      <w:r>
+        <w:br/>
+      </w:r>
+      <w:r>
+        <w:rPr>
+          <w:rStyle w:val="NormalTok"/>
+        </w:rPr>
+        <w:t xml:space="preserve">   dplyr</w:t>
+      </w:r>
+      <w:r>
+        <w:rPr>
+          <w:rStyle w:val="SpecialCharTok"/>
+        </w:rPr>
+        <w:t xml:space="preserve">::</w:t>
+      </w:r>
+      <w:r>
+        <w:rPr>
           <w:rStyle w:val="FunctionTok"/>
         </w:rPr>
-        <w:t xml:space="preserve">ncol</w:t>
-      </w:r>
-      <w:r>
-        <w:rPr>
-          <w:rStyle w:val="NormalTok"/>
-        </w:rPr>
-        <w:t xml:space="preserve">(corr_matrix) </w:t>
-      </w:r>
-      <w:r>
-        <w:rPr>
-          <w:rStyle w:val="SpecialCharTok"/>
-        </w:rPr>
-        <w:t xml:space="preserve">+</w:t>
-      </w:r>
-      <w:r>
-        <w:rPr>
-          <w:rStyle w:val="NormalTok"/>
-        </w:rPr>
-        <w:t xml:space="preserve"> </w:t>
-      </w:r>
-      <w:r>
-        <w:rPr>
-          <w:rStyle w:val="DecValTok"/>
-        </w:rPr>
-        <w:t xml:space="preserve">1</w:t>
-      </w:r>
-      <w:r>
-        <w:rPr>
-          <w:rStyle w:val="NormalTok"/>
-        </w:rPr>
-        <w:t xml:space="preserve">)] </w:t>
-      </w:r>
-      <w:r>
-        <w:rPr>
-          <w:rStyle w:val="OtherTok"/>
-        </w:rPr>
-        <w:t xml:space="preserve">&lt;-</w:t>
-      </w:r>
-      <w:r>
-        <w:rPr>
-          <w:rStyle w:val="NormalTok"/>
-        </w:rPr>
-        <w:t xml:space="preserve"> corr_matrix</w:t>
-      </w:r>
-      <w:r>
-        <w:br/>
-      </w:r>
-      <w:r>
-        <w:rPr>
-          <w:rStyle w:val="NormalTok"/>
-        </w:rPr>
-        <w:t xml:space="preserve">sigma[</w:t>
-      </w:r>
-      <w:r>
-        <w:rPr>
-          <w:rStyle w:val="DecValTok"/>
-        </w:rPr>
-        <w:t xml:space="preserve">1</w:t>
-      </w:r>
-      <w:r>
-        <w:rPr>
-          <w:rStyle w:val="NormalTok"/>
-        </w:rPr>
-        <w:t xml:space="preserve">, </w:t>
-      </w:r>
-      <w:r>
-        <w:rPr>
-          <w:rStyle w:val="DecValTok"/>
-        </w:rPr>
-        <w:t xml:space="preserve">2</w:t>
-      </w:r>
-      <w:r>
-        <w:rPr>
-          <w:rStyle w:val="SpecialCharTok"/>
-        </w:rPr>
-        <w:t xml:space="preserve">:</w:t>
-      </w:r>
-      <w:r>
-        <w:rPr>
-          <w:rStyle w:val="NormalTok"/>
-        </w:rPr>
-        <w:t xml:space="preserve">(n_good_covs </w:t>
-      </w:r>
-      <w:r>
-        <w:rPr>
-          <w:rStyle w:val="SpecialCharTok"/>
-        </w:rPr>
-        <w:t xml:space="preserve">+</w:t>
-      </w:r>
-      <w:r>
-        <w:rPr>
-          <w:rStyle w:val="NormalTok"/>
-        </w:rPr>
-        <w:t xml:space="preserve"> </w:t>
-      </w:r>
-      <w:r>
-        <w:rPr>
-          <w:rStyle w:val="DecValTok"/>
-        </w:rPr>
-        <w:t xml:space="preserve">1</w:t>
-      </w:r>
-      <w:r>
-        <w:rPr>
-          <w:rStyle w:val="NormalTok"/>
-        </w:rPr>
-        <w:t xml:space="preserve">)] </w:t>
-      </w:r>
-      <w:r>
-        <w:rPr>
-          <w:rStyle w:val="OtherTok"/>
-        </w:rPr>
-        <w:t xml:space="preserve">&lt;-</w:t>
-      </w:r>
-      <w:r>
-        <w:rPr>
-          <w:rStyle w:val="NormalTok"/>
-        </w:rPr>
-        <w:t xml:space="preserve"> </w:t>
-      </w:r>
-      <w:r>
-        <w:rPr>
-          <w:rStyle w:val="FunctionTok"/>
-        </w:rPr>
-        <w:t xml:space="preserve">rep</w:t>
-      </w:r>
-      <w:r>
-        <w:rPr>
-          <w:rStyle w:val="NormalTok"/>
-        </w:rPr>
-        <w:t xml:space="preserve">(r_ycov, n_good_covs)</w:t>
-      </w:r>
-      <w:r>
-        <w:br/>
-      </w:r>
-      <w:r>
-        <w:rPr>
-          <w:rStyle w:val="NormalTok"/>
-        </w:rPr>
-        <w:t xml:space="preserve">sigma[</w:t>
-      </w:r>
-      <w:r>
-        <w:rPr>
-          <w:rStyle w:val="DecValTok"/>
-        </w:rPr>
-        <w:t xml:space="preserve">2</w:t>
-      </w:r>
-      <w:r>
-        <w:rPr>
-          <w:rStyle w:val="SpecialCharTok"/>
-        </w:rPr>
-        <w:t xml:space="preserve">:</w:t>
-      </w:r>
-      <w:r>
-        <w:rPr>
-          <w:rStyle w:val="NormalTok"/>
-        </w:rPr>
-        <w:t xml:space="preserve">(n_good_covs </w:t>
-      </w:r>
-      <w:r>
-        <w:rPr>
-          <w:rStyle w:val="SpecialCharTok"/>
-        </w:rPr>
-        <w:t xml:space="preserve">+</w:t>
-      </w:r>
-      <w:r>
-        <w:rPr>
-          <w:rStyle w:val="NormalTok"/>
-        </w:rPr>
-        <w:t xml:space="preserve"> </w:t>
-      </w:r>
-      <w:r>
-        <w:rPr>
-          <w:rStyle w:val="DecValTok"/>
-        </w:rPr>
-        <w:t xml:space="preserve">1</w:t>
-      </w:r>
-      <w:r>
-        <w:rPr>
-          <w:rStyle w:val="NormalTok"/>
-        </w:rPr>
-        <w:t xml:space="preserve">), </w:t>
-      </w:r>
-      <w:r>
-        <w:rPr>
-          <w:rStyle w:val="DecValTok"/>
-        </w:rPr>
-        <w:t xml:space="preserve">1</w:t>
-      </w:r>
-      <w:r>
-        <w:rPr>
-          <w:rStyle w:val="NormalTok"/>
-        </w:rPr>
-        <w:t xml:space="preserve">] </w:t>
-      </w:r>
-      <w:r>
-        <w:rPr>
-          <w:rStyle w:val="OtherTok"/>
-        </w:rPr>
-        <w:t xml:space="preserve">&lt;-</w:t>
-      </w:r>
-      <w:r>
-        <w:rPr>
-          <w:rStyle w:val="NormalTok"/>
-        </w:rPr>
-        <w:t xml:space="preserve"> </w:t>
-      </w:r>
-      <w:r>
-        <w:rPr>
-          <w:rStyle w:val="FunctionTok"/>
-        </w:rPr>
-        <w:t xml:space="preserve">rep</w:t>
-      </w:r>
-      <w:r>
-        <w:rPr>
-          <w:rStyle w:val="NormalTok"/>
-        </w:rPr>
-        <w:t xml:space="preserve">(r_ycov, n_good_covs)</w:t>
-      </w:r>
-      <w:r>
-        <w:br/>
-      </w:r>
-      <w:r>
-        <w:rPr>
-          <w:rStyle w:val="NormalTok"/>
-        </w:rPr>
-        <w:t xml:space="preserve">  </w:t>
-      </w:r>
-      <w:r>
-        <w:br/>
-      </w:r>
-      <w:r>
-        <w:rPr>
-          <w:rStyle w:val="NormalTok"/>
-        </w:rPr>
-        <w:t xml:space="preserve">ycovs </w:t>
-      </w:r>
-      <w:r>
-        <w:rPr>
-          <w:rStyle w:val="OtherTok"/>
-        </w:rPr>
-        <w:t xml:space="preserve">&lt;-</w:t>
-      </w:r>
-      <w:r>
-        <w:rPr>
-          <w:rStyle w:val="NormalTok"/>
-        </w:rPr>
-        <w:t xml:space="preserve"> MASS</w:t>
-      </w:r>
-      <w:r>
-        <w:rPr>
-          <w:rStyle w:val="SpecialCharTok"/>
-        </w:rPr>
-        <w:t xml:space="preserve">::</w:t>
-      </w:r>
-      <w:r>
-        <w:rPr>
-          <w:rStyle w:val="FunctionTok"/>
-        </w:rPr>
-        <w:t xml:space="preserve">mvrnorm</w:t>
-      </w:r>
-      <w:r>
-        <w:rPr>
-          <w:rStyle w:val="NormalTok"/>
-        </w:rPr>
-        <w:t xml:space="preserve">(n_obs, </w:t>
-      </w:r>
-      <w:r>
-        <w:rPr>
-          <w:rStyle w:val="AttributeTok"/>
-        </w:rPr>
-        <w:t xml:space="preserve">mu =</w:t>
-      </w:r>
-      <w:r>
-        <w:rPr>
-          <w:rStyle w:val="NormalTok"/>
-        </w:rPr>
-        <w:t xml:space="preserve"> </w:t>
-      </w:r>
-      <w:r>
-        <w:rPr>
-          <w:rStyle w:val="FunctionTok"/>
-        </w:rPr>
-        <w:t xml:space="preserve">rep</w:t>
-      </w:r>
-      <w:r>
-        <w:rPr>
-          <w:rStyle w:val="NormalTok"/>
-        </w:rPr>
-        <w:t xml:space="preserve">(</w:t>
-      </w:r>
-      <w:r>
-        <w:rPr>
-          <w:rStyle w:val="DecValTok"/>
-        </w:rPr>
-        <w:t xml:space="preserve">0</w:t>
-      </w:r>
-      <w:r>
-        <w:rPr>
-          <w:rStyle w:val="NormalTok"/>
-        </w:rPr>
-        <w:t xml:space="preserve">, n_covs </w:t>
-      </w:r>
-      <w:r>
-        <w:rPr>
-          <w:rStyle w:val="SpecialCharTok"/>
-        </w:rPr>
-        <w:t xml:space="preserve">+</w:t>
-      </w:r>
-      <w:r>
-        <w:rPr>
-          <w:rStyle w:val="NormalTok"/>
-        </w:rPr>
-        <w:t xml:space="preserve"> </w:t>
-      </w:r>
-      <w:r>
-        <w:rPr>
-          <w:rStyle w:val="DecValTok"/>
-        </w:rPr>
-        <w:t xml:space="preserve">1</w:t>
-      </w:r>
-      <w:r>
-        <w:rPr>
-          <w:rStyle w:val="NormalTok"/>
-        </w:rPr>
-        <w:t xml:space="preserve">), </w:t>
-      </w:r>
-      <w:r>
-        <w:rPr>
-          <w:rStyle w:val="AttributeTok"/>
-        </w:rPr>
-        <w:t xml:space="preserve">Sigma =</w:t>
-      </w:r>
-      <w:r>
-        <w:rPr>
-          <w:rStyle w:val="NormalTok"/>
-        </w:rPr>
-        <w:t xml:space="preserve"> sigma)</w:t>
-      </w:r>
-      <w:r>
-        <w:br/>
-      </w:r>
-      <w:r>
-        <w:rPr>
-          <w:rStyle w:val="NormalTok"/>
-        </w:rPr>
-        <w:t xml:space="preserve">y </w:t>
-      </w:r>
-      <w:r>
-        <w:rPr>
-          <w:rStyle w:val="OtherTok"/>
-        </w:rPr>
-        <w:t xml:space="preserve">&lt;-</w:t>
-      </w:r>
-      <w:r>
-        <w:rPr>
-          <w:rStyle w:val="NormalTok"/>
-        </w:rPr>
-        <w:t xml:space="preserve"> ycovs[, </w:t>
-      </w:r>
-      <w:r>
-        <w:rPr>
-          <w:rStyle w:val="DecValTok"/>
-        </w:rPr>
-        <w:t xml:space="preserve">1</w:t>
-      </w:r>
-      <w:r>
-        <w:rPr>
-          <w:rStyle w:val="NormalTok"/>
-        </w:rPr>
-        <w:t xml:space="preserve">]</w:t>
-      </w:r>
-      <w:r>
-        <w:br/>
-      </w:r>
-      <w:r>
-        <w:rPr>
-          <w:rStyle w:val="NormalTok"/>
-        </w:rPr>
-        <w:t xml:space="preserve">covs </w:t>
-      </w:r>
-      <w:r>
-        <w:rPr>
-          <w:rStyle w:val="OtherTok"/>
-        </w:rPr>
-        <w:t xml:space="preserve">&lt;-</w:t>
-      </w:r>
-      <w:r>
-        <w:rPr>
-          <w:rStyle w:val="NormalTok"/>
-        </w:rPr>
-        <w:t xml:space="preserve"> ycovs[, </w:t>
-      </w:r>
-      <w:r>
-        <w:rPr>
-          <w:rStyle w:val="SpecialCharTok"/>
-        </w:rPr>
-        <w:t xml:space="preserve">-</w:t>
-      </w:r>
-      <w:r>
-        <w:rPr>
-          <w:rStyle w:val="DecValTok"/>
-        </w:rPr>
-        <w:t xml:space="preserve">1</w:t>
-      </w:r>
-      <w:r>
-        <w:rPr>
-          <w:rStyle w:val="NormalTok"/>
-        </w:rPr>
-        <w:t xml:space="preserve">]</w:t>
-      </w:r>
-      <w:r>
-        <w:br/>
-      </w:r>
-      <w:r>
-        <w:rPr>
-          <w:rStyle w:val="NormalTok"/>
-        </w:rPr>
-        <w:t xml:space="preserve">  </w:t>
-      </w:r>
-      <w:r>
-        <w:br/>
-      </w:r>
-      <w:r>
-        <w:rPr>
-          <w:rStyle w:val="NormalTok"/>
-        </w:rPr>
-        <w:t xml:space="preserve">y </w:t>
-      </w:r>
-      <w:r>
-        <w:rPr>
-          <w:rStyle w:val="OtherTok"/>
-        </w:rPr>
-        <w:t xml:space="preserve">&lt;-</w:t>
-      </w:r>
-      <w:r>
-        <w:rPr>
-          <w:rStyle w:val="NormalTok"/>
-        </w:rPr>
-        <w:t xml:space="preserve"> y </w:t>
-      </w:r>
-      <w:r>
-        <w:rPr>
-          <w:rStyle w:val="SpecialCharTok"/>
-        </w:rPr>
-        <w:t xml:space="preserve">+</w:t>
-      </w:r>
-      <w:r>
-        <w:rPr>
-          <w:rStyle w:val="NormalTok"/>
-        </w:rPr>
-        <w:t xml:space="preserve"> b_x </w:t>
-      </w:r>
-      <w:r>
-        <w:rPr>
-          <w:rStyle w:val="SpecialCharTok"/>
-        </w:rPr>
-        <w:t xml:space="preserve">*</w:t>
-      </w:r>
-      <w:r>
-        <w:rPr>
-          <w:rStyle w:val="NormalTok"/>
-        </w:rPr>
-        <w:t xml:space="preserve"> x</w:t>
-      </w:r>
-      <w:r>
-        <w:br/>
-      </w:r>
-      <w:r>
-        <w:rPr>
-          <w:rStyle w:val="NormalTok"/>
-        </w:rPr>
-        <w:t xml:space="preserve"> </w:t>
-      </w:r>
-      <w:r>
-        <w:br/>
-      </w:r>
-      <w:r>
-        <w:rPr>
-          <w:rStyle w:val="NormalTok"/>
-        </w:rPr>
-        <w:t xml:space="preserve">covs </w:t>
-      </w:r>
-      <w:r>
-        <w:rPr>
-          <w:rStyle w:val="OtherTok"/>
-        </w:rPr>
-        <w:t xml:space="preserve">&lt;-</w:t>
-      </w:r>
-      <w:r>
-        <w:rPr>
-          <w:rStyle w:val="NormalTok"/>
-        </w:rPr>
-        <w:t xml:space="preserve"> covs </w:t>
-      </w:r>
-      <w:r>
-        <w:rPr>
-          <w:rStyle w:val="SpecialCharTok"/>
-        </w:rPr>
-        <w:t xml:space="preserve">|&gt;</w:t>
-      </w:r>
-      <w:r>
-        <w:br/>
-      </w:r>
-      <w:r>
-        <w:rPr>
-          <w:rStyle w:val="NormalTok"/>
-        </w:rPr>
-        <w:t xml:space="preserve">    tibble</w:t>
-      </w:r>
-      <w:r>
-        <w:rPr>
-          <w:rStyle w:val="SpecialCharTok"/>
-        </w:rPr>
-        <w:t xml:space="preserve">::</w:t>
-      </w:r>
-      <w:r>
-        <w:rPr>
-          <w:rStyle w:val="FunctionTok"/>
-        </w:rPr>
-        <w:t xml:space="preserve">as_tibble</w:t>
-      </w:r>
-      <w:r>
-        <w:rPr>
-          <w:rStyle w:val="NormalTok"/>
-        </w:rPr>
-        <w:t xml:space="preserve">(</w:t>
-      </w:r>
-      <w:r>
-        <w:rPr>
-          <w:rStyle w:val="AttributeTok"/>
-        </w:rPr>
-        <w:t xml:space="preserve">.name_repair =</w:t>
-      </w:r>
-      <w:r>
-        <w:rPr>
-          <w:rStyle w:val="NormalTok"/>
-        </w:rPr>
-        <w:t xml:space="preserve"> </w:t>
-      </w:r>
-      <w:r>
-        <w:rPr>
-          <w:rStyle w:val="StringTok"/>
-        </w:rPr>
-        <w:t xml:space="preserve">"minimal"</w:t>
-      </w:r>
-      <w:r>
-        <w:rPr>
-          <w:rStyle w:val="NormalTok"/>
-        </w:rPr>
-        <w:t xml:space="preserve">)</w:t>
-      </w:r>
-      <w:r>
-        <w:br/>
-      </w:r>
-      <w:r>
-        <w:rPr>
-          <w:rStyle w:val="NormalTok"/>
-        </w:rPr>
-        <w:t xml:space="preserve">  </w:t>
-      </w:r>
-      <w:r>
-        <w:br/>
-      </w:r>
-      <w:r>
-        <w:rPr>
-          <w:rStyle w:val="FunctionTok"/>
-        </w:rPr>
-        <w:t xml:space="preserve">names</w:t>
-      </w:r>
-      <w:r>
-        <w:rPr>
-          <w:rStyle w:val="NormalTok"/>
-        </w:rPr>
-        <w:t xml:space="preserve">(covs) </w:t>
-      </w:r>
-      <w:r>
-        <w:rPr>
-          <w:rStyle w:val="OtherTok"/>
-        </w:rPr>
-        <w:t xml:space="preserve">&lt;-</w:t>
-      </w:r>
-      <w:r>
-        <w:rPr>
-          <w:rStyle w:val="NormalTok"/>
-        </w:rPr>
-        <w:t xml:space="preserve"> stringr</w:t>
-      </w:r>
-      <w:r>
-        <w:rPr>
-          <w:rStyle w:val="SpecialCharTok"/>
-        </w:rPr>
-        <w:t xml:space="preserve">::</w:t>
-      </w:r>
-      <w:r>
-        <w:rPr>
-          <w:rStyle w:val="FunctionTok"/>
-        </w:rPr>
-        <w:t xml:space="preserve">str_c</w:t>
-      </w:r>
-      <w:r>
-        <w:rPr>
-          <w:rStyle w:val="NormalTok"/>
-        </w:rPr>
-        <w:t xml:space="preserve">(</w:t>
-      </w:r>
-      <w:r>
-        <w:rPr>
-          <w:rStyle w:val="StringTok"/>
-        </w:rPr>
-        <w:t xml:space="preserve">"c"</w:t>
-      </w:r>
-      <w:r>
-        <w:rPr>
-          <w:rStyle w:val="NormalTok"/>
-        </w:rPr>
-        <w:t xml:space="preserve">, </w:t>
-      </w:r>
-      <w:r>
-        <w:rPr>
-          <w:rStyle w:val="DecValTok"/>
-        </w:rPr>
-        <w:t xml:space="preserve">1</w:t>
-      </w:r>
-      <w:r>
-        <w:rPr>
-          <w:rStyle w:val="SpecialCharTok"/>
-        </w:rPr>
-        <w:t xml:space="preserve">:</w:t>
-      </w:r>
-      <w:r>
-        <w:rPr>
-          <w:rStyle w:val="NormalTok"/>
-        </w:rPr>
-        <w:t xml:space="preserve">n_covs)</w:t>
-      </w:r>
-      <w:r>
-        <w:br/>
-      </w:r>
-      <w:r>
-        <w:rPr>
-          <w:rStyle w:val="NormalTok"/>
-        </w:rPr>
-        <w:t xml:space="preserve">  </w:t>
-      </w:r>
-      <w:r>
-        <w:br/>
-      </w:r>
-      <w:r>
-        <w:rPr>
-          <w:rStyle w:val="NormalTok"/>
-        </w:rPr>
-        <w:t xml:space="preserve">df </w:t>
-      </w:r>
-      <w:r>
-        <w:rPr>
-          <w:rStyle w:val="OtherTok"/>
-        </w:rPr>
-        <w:t xml:space="preserve">&lt;-</w:t>
-      </w:r>
-      <w:r>
-        <w:rPr>
-          <w:rStyle w:val="NormalTok"/>
-        </w:rPr>
-        <w:t xml:space="preserve"> tibble</w:t>
-      </w:r>
-      <w:r>
-        <w:rPr>
-          <w:rStyle w:val="SpecialCharTok"/>
-        </w:rPr>
-        <w:t xml:space="preserve">::</w:t>
-      </w:r>
-      <w:r>
-        <w:rPr>
-          <w:rStyle w:val="FunctionTok"/>
-        </w:rPr>
-        <w:t xml:space="preserve">tibble</w:t>
-      </w:r>
-      <w:r>
-        <w:rPr>
-          <w:rStyle w:val="NormalTok"/>
-        </w:rPr>
-        <w:t xml:space="preserve">(</w:t>
-      </w:r>
-      <w:r>
-        <w:rPr>
-          <w:rStyle w:val="AttributeTok"/>
-        </w:rPr>
-        <w:t xml:space="preserve">y =</w:t>
-      </w:r>
-      <w:r>
-        <w:rPr>
-          <w:rStyle w:val="NormalTok"/>
-        </w:rPr>
-        <w:t xml:space="preserve"> y, </w:t>
-      </w:r>
-      <w:r>
-        <w:rPr>
-          <w:rStyle w:val="AttributeTok"/>
-        </w:rPr>
-        <w:t xml:space="preserve">x =</w:t>
-      </w:r>
-      <w:r>
-        <w:rPr>
-          <w:rStyle w:val="NormalTok"/>
-        </w:rPr>
-        <w:t xml:space="preserve"> x) </w:t>
-      </w:r>
-      <w:r>
-        <w:rPr>
-          <w:rStyle w:val="SpecialCharTok"/>
-        </w:rPr>
-        <w:t xml:space="preserve">|&gt;</w:t>
-      </w:r>
-      <w:r>
-        <w:rPr>
-          <w:rStyle w:val="NormalTok"/>
-        </w:rPr>
-        <w:t xml:space="preserve"> </w:t>
-      </w:r>
-      <w:r>
-        <w:br/>
-      </w:r>
-      <w:r>
-        <w:rPr>
-          <w:rStyle w:val="NormalTok"/>
-        </w:rPr>
-        <w:t xml:space="preserve">   dplyr</w:t>
-      </w:r>
-      <w:r>
-        <w:rPr>
-          <w:rStyle w:val="SpecialCharTok"/>
-        </w:rPr>
-        <w:t xml:space="preserve">::</w:t>
-      </w:r>
-      <w:r>
-        <w:rPr>
-          <w:rStyle w:val="FunctionTok"/>
-        </w:rPr>
         <w:t xml:space="preserve">bind_cols</w:t>
       </w:r>
       <w:r>
@@ -2742,7 +2715,7 @@
         <w:pStyle w:val="Definition"/>
       </w:pPr>
       <w:r>
-        <w:t xml:space="preserve">Create variance/covariance matrix.Good predictors have 0.3 correlation with each other</w:t>
+        <w:t xml:space="preserve">Create variance/covariance matrix. Good predictors have 0.3 correlation with each other.</w:t>
       </w:r>
     </w:p>
     <w:p>
@@ -2750,7 +2723,7 @@
         <w:pStyle w:val="DefinitionTerm"/>
       </w:pPr>
       <w:r>
-        <w:t xml:space="preserve">Line 21</w:t>
+        <w:t xml:space="preserve">Line 20</w:t>
       </w:r>
     </w:p>
     <w:p>
@@ -2766,7 +2739,7 @@
         <w:pStyle w:val="DefinitionTerm"/>
       </w:pPr>
       <w:r>
-        <w:t xml:space="preserve">Line 25</w:t>
+        <w:t xml:space="preserve">Line 24</w:t>
       </w:r>
     </w:p>
     <w:p>
@@ -2782,7 +2755,7 @@
         <w:pStyle w:val="DefinitionTerm"/>
       </w:pPr>
       <w:r>
-        <w:t xml:space="preserve">Line 27</w:t>
+        <w:t xml:space="preserve">Line 26</w:t>
       </w:r>
     </w:p>
     <w:p>

</xml_diff>

<commit_message>
freeze files for rendering
</commit_message>
<xml_diff>
--- a/_manuscript/index.docx
+++ b/_manuscript/index.docx
@@ -47,7 +47,7 @@
         <w:pStyle w:val="Date"/>
       </w:pPr>
       <w:r>
-        <w:t xml:space="preserve">2026-04-15</w:t>
+        <w:t xml:space="preserve">2026-04-16</w:t>
       </w:r>
     </w:p>
     <w:p>
@@ -63,10 +63,29 @@
         <w:pStyle w:val="Abstract"/>
       </w:pPr>
       <w:r>
-        <w:t xml:space="preserve">Including covariates in tests of experimentally manipulated independent variables (IVs) can reduce Type II error by explaining outcome variance, but selecting optimal covariates is challenging. Iterating over many covariates and retaining only those that increase the focal effect (i.e.,</w:t>
-      </w:r>
-      <w:r>
-        <w:t xml:space="preserve"> </w:t>
+        <w:t xml:space="preserve">Including covariates when testing an experimentally manipulated independent variable (</w:t>
+      </w:r>
+      <m:oMath>
+        <m:r>
+          <m:t>X</m:t>
+        </m:r>
+      </m:oMath>
+      <w:r>
+        <w:t xml:space="preserve">) can reduce Type II error by accounting for additional variance in the outcome. Selecting optimal covariates, however, is challenging. Iterating over many covariates and retaining only those that increase the</w:t>
+      </w:r>
+      <w:r>
+        <w:t xml:space="preserve"> </w:t>
+      </w:r>
+      <m:oMath>
+        <m:r>
+          <m:t>X</m:t>
+        </m:r>
+      </m:oMath>
+      <w:r>
+        <w:t xml:space="preserve"> </w:t>
+      </w:r>
+      <w:r>
+        <w:t xml:space="preserve">effect (</w:t>
       </w:r>
       <w:r>
         <w:rPr>
@@ -76,7 +95,7 @@
         <w:t xml:space="preserve">p</w:t>
       </w:r>
       <w:r>
-        <w:t xml:space="preserve">-hacking) substantially inflates Type I error. As a result, researchers often adopt two extremes: including no covariates or all covariates. Although these approaches do not nominally increase Type I error rates, both can reduce power. Data-driven approaches may offer a more effective alternative.</w:t>
+        <w:t xml:space="preserve">-hacking) substantially inflates Type I error. Consequently, researchers often adopt two extremes: including no covariates or all covariates. Although these approaches do not nominally increase Type I error rates, both can reduce power. Data-driven approaches may offer a more effective alternative.</w:t>
       </w:r>
     </w:p>
     <w:p>
@@ -84,7 +103,7 @@
         <w:pStyle w:val="Abstract"/>
       </w:pPr>
       <w:r>
-        <w:t xml:space="preserve">We simulated 40,000 datasets across 540 conditions varying in effect size, sample size, number of covariates, and covariate-outcome relationships. Across these data sets we compared nine selection methods: two traditional approaches (no covariates, all covariates) and seven data-driven approaches using covariate screening models (</w:t>
+        <w:t xml:space="preserve">We simulated 40,000 datasets across 540 research contexts varying in effect size, sample size, number of covariates, and covariate-outcome relationships. We evaluated nine selection methods: two traditional approaches (no covariates, all covariates) and seven data-driven approaches using covariate screening models (</w:t>
       </w:r>
       <w:r>
         <w:rPr>
@@ -94,7 +113,40 @@
         <w:t xml:space="preserve">p</w:t>
       </w:r>
       <w:r>
-        <w:t xml:space="preserve">-hacking, linear models that screen each covariate separately in its own model with and without the IV, linear models that screen all covariates simultaneously in a single model with and without the IV, and LASSO models that screen all covariates simultaneously in a single model with and without the IV.</w:t>
+        <w:t xml:space="preserve">-hacking, linear models that screen each covariate separately with and without</w:t>
+      </w:r>
+      <w:r>
+        <w:t xml:space="preserve"> </w:t>
+      </w:r>
+      <m:oMath>
+        <m:r>
+          <m:t>X</m:t>
+        </m:r>
+      </m:oMath>
+      <w:r>
+        <w:t xml:space="preserve">, linear models that screen all covariates simultaneously with and without</w:t>
+      </w:r>
+      <w:r>
+        <w:t xml:space="preserve"> </w:t>
+      </w:r>
+      <m:oMath>
+        <m:r>
+          <m:t>X</m:t>
+        </m:r>
+      </m:oMath>
+      <w:r>
+        <w:t xml:space="preserve">, and LASSO models that screen all covariates simultaneously with and without</w:t>
+      </w:r>
+      <w:r>
+        <w:t xml:space="preserve"> </w:t>
+      </w:r>
+      <m:oMath>
+        <m:r>
+          <m:t>X</m:t>
+        </m:r>
+      </m:oMath>
+      <w:r>
+        <w:t xml:space="preserve">).</w:t>
       </w:r>
     </w:p>
     <w:p>
@@ -102,7 +154,7 @@
         <w:pStyle w:val="Abstract"/>
       </w:pPr>
       <w:r>
-        <w:t xml:space="preserve">We quantified the probability of Type I and Type II errors across selection methods and research contexts. Our results provide strong evidence of the benefits of using covariates and provide practical guidance for improving statistical power while maintaining appropriate Type I error control in experimental research.</w:t>
+        <w:t xml:space="preserve">We calculated the probability of Type I and Type II errors across methods and research contexts. Our results provide strong evidence of the benefits of using covariates and provide practical guidance for selecting covariates in experimental research.</w:t>
       </w:r>
     </w:p>
     <w:bookmarkStart w:id="20" w:name="introduction"/>
@@ -352,7 +404,10 @@
         <w:t xml:space="preserve"> </w:t>
       </w:r>
       <w:r>
-        <w:t xml:space="preserve">to identify which covariates display significant relationships with the outcome variable and will be included in the subsequent primary analysis that tests the focal IV. Across these screening models, we consider</w:t>
+        <w:t xml:space="preserve">to identify which covariates display significant relationships with the outcome variable and will be included in the subsequent primary analysis that tests the focal IV</w:t>
+      </w:r>
+      <w:r>
+        <w:t xml:space="preserve">. Across these screening models, we consider</w:t>
       </w:r>
       <w:r>
         <w:t xml:space="preserve"> </w:t>

</xml_diff>

<commit_message>
updates to method terminology
</commit_message>
<xml_diff>
--- a/_manuscript/index.docx
+++ b/_manuscript/index.docx
@@ -47,7 +47,7 @@
         <w:pStyle w:val="Date"/>
       </w:pPr>
       <w:r>
-        <w:t xml:space="preserve">2026-06-10</w:t>
+        <w:t xml:space="preserve">2026-06-19</w:t>
       </w:r>
     </w:p>
     <w:p>
@@ -95,7 +95,7 @@
         <w:t xml:space="preserve">p</w:t>
       </w:r>
       <w:r>
-        <w:t xml:space="preserve">-hacking) substantially inflates Type I error. Consequently, researchers often adopt two extremes: including no covariates or all covariates. Although these approaches do not nominally increase Type I error rates, both can reduce power. Data-driven approaches may offer a more effective alternative.</w:t>
+        <w:t xml:space="preserve">-hacking) substantially inflates Type I error. Consequently, researchers often adopt two extremes: including no covariates or all covariates. Although these approaches do not nominally increase Type I error rates, both fail to maximize power. Data-driven approaches may offer a more effective alternative.</w:t>
       </w:r>
     </w:p>
     <w:p>
@@ -154,7 +154,7 @@
         <w:pStyle w:val="Abstract"/>
       </w:pPr>
       <w:r>
-        <w:t xml:space="preserve">We calculated the probability of Type I and Type II errors across methods and research contexts. Our results provide strong evidence of the benefits of using covariates and provide practical guidance for selecting covariates in experimental research.</w:t>
+        <w:t xml:space="preserve">We calculated the probability of Type I and Type II errors across methods and research contexts. Our results provide strong evidence of the benefits of using covariates and practical guidance for selecting covariates in experimental research.</w:t>
       </w:r>
     </w:p>
     <w:bookmarkStart w:id="20" w:name="introduction"/>
@@ -180,7 +180,25 @@
         <w:t xml:space="preserve">(Bradford, Shapiro, and Curtin 2013; Hefner et al. 2013)</w:t>
       </w:r>
       <w:r>
-        <w:t xml:space="preserve">. [Markus, can you provide a simple second example that focuses on an IV manipulation that is social psych relevant?)</w:t>
+        <w:t xml:space="preserve">. A valid test of the effect of such an IV requires adequate statistical power</w:t>
+      </w:r>
+      <w:r>
+        <w:t xml:space="preserve"> </w:t>
+      </w:r>
+      <w:r>
+        <w:t xml:space="preserve">(Cohen 1988, 1992)</w:t>
+      </w:r>
+      <w:r>
+        <w:t xml:space="preserve">. By definition, low statistical power is associated with a high probability of a Type II error (i.e., failure to reject a false null hypothesis). Furthermore, significant effects detected by low-powered studies may not replicate (due to low positive predictive value) and estimates of their effect size may be positively biased (due to publication bias). For all these reasons, methods to reduce Type II errors when testing IV effects are critically important for a robust scientific literature</w:t>
+      </w:r>
+      <w:r>
+        <w:t xml:space="preserve"> </w:t>
+      </w:r>
+      <w:r>
+        <w:t xml:space="preserve">(Cohen 1962; Button et al. 2013)</w:t>
+      </w:r>
+      <w:r>
+        <w:t xml:space="preserve">.</w:t>
       </w:r>
     </w:p>
     <w:p>
@@ -188,25 +206,16 @@
         <w:pStyle w:val="BodyText"/>
       </w:pPr>
       <w:r>
-        <w:t xml:space="preserve">A valid test of the effect of an IV requires adequate statistical power</w:t>
-      </w:r>
-      <w:r>
-        <w:t xml:space="preserve"> </w:t>
-      </w:r>
-      <w:r>
-        <w:t xml:space="preserve">(Cohen 1988, 1992)</w:t>
-      </w:r>
-      <w:r>
-        <w:t xml:space="preserve">. By definition, low statistical power is associated with a high probability of a Type II error (i.e., failure to reject a false null hypothesis). Furthermore, significant effects detected by low-powered studies may not replicate (due to low positive predictive value) and estimates of their effect size may be positively biased (due to publication bias). For all these reasons, methods to reduce Type II errors are critically important for a robust scientific literature</w:t>
-      </w:r>
-      <w:r>
-        <w:t xml:space="preserve"> </w:t>
-      </w:r>
-      <w:r>
-        <w:t xml:space="preserve">(Cohen 1962; Button et al. 2013)</w:t>
-      </w:r>
-      <w:r>
-        <w:t xml:space="preserve">.</w:t>
+        <w:t xml:space="preserve">The use of covariates that are measured at baseline (i.e., prior to random assignment/manipulation of the focal IV) has been shown to reduce Type II errors by accounting for unexplained variance in the outcome that would otherwise be treated as noise in the analysis</w:t>
+      </w:r>
+      <w:r>
+        <w:t xml:space="preserve"> </w:t>
+      </w:r>
+      <w:r>
+        <w:t xml:space="preserve">(Thompson et al. 2015; Adrián V. Hernández, Steyerberg, and Habbema 2004; Adrián V. Hernández, Eijkemans, and Steyerberg 2006; Kahan et al. 2014; Van Breukelen 2006; Egbewale, Lewis, and Sim 2014)</w:t>
+      </w:r>
+      <w:r>
+        <w:t xml:space="preserve">. For example, in the previously described test of the effect of alcohol on stress response, baseline measures of both trait anxiety and fearfulness could be included as covariates. These measures would not be systematically correlated with the IV because they are collected prior to random assignment. They would also be expected to correlate with laboratory stress response based on prior research. Given this, the addition of these measures as covariates in the analysis could reduce variance in stress response that is unrelated to the manipulation and lower the probability of a Type II error for the IV effect.</w:t>
       </w:r>
     </w:p>
     <w:p>
@@ -214,24 +223,7 @@
         <w:pStyle w:val="BodyText"/>
       </w:pPr>
       <w:r>
-        <w:t xml:space="preserve">The use of covariates that are measured at baseline (i.e., prior to random assignment/manipulation of the focal IV) has been shown to reduce Type II errors by accounting for unexplained variance in the outcome that would otherwise be treated as noise in the analysis</w:t>
-      </w:r>
-      <w:r>
-        <w:t xml:space="preserve"> </w:t>
-      </w:r>
-      <w:r>
-        <w:t xml:space="preserve">(Thompson et al. 2015; Adrián V. Hernández, Steyerberg, and Habbema 2004; Adrián V. Hernández, Eijkemans, and Steyerberg 2006; Kahan et al. 2014; Van Breukelen 2006; Egbewale, Lewis, and Sim 2014)</w:t>
-      </w:r>
-      <w:r>
-        <w:t xml:space="preserve">. For example, in the previously described test of the effect of alcohol on stress response, baseline measures of both trait anxiety and fearfulness could be included as covariates. These measures would not be systematically correlated with the IV because they are collected prior to random assignment. They would also be expected to correlate with laboratory stress response based on prior research. Given this, the addition of these measures as covariates in the analysis could reduce variance in stress response that is unrelated to the manipulation and lower the probability of a Type II error for the IV effect.</w:t>
-      </w:r>
-    </w:p>
-    <w:p>
-      <w:pPr>
-        <w:pStyle w:val="BodyText"/>
-      </w:pPr>
-      <w:r>
-        <w:t xml:space="preserve">However, selection of the optimal covariates to reduce Type II error is not straightforward. Historically, researchers often iterated over a large set of available covariates and included only those covariates that increased the effect size of the test of their focal IV (and their chances of obtaining a significant</w:t>
+        <w:t xml:space="preserve">However, selection of the optimal covariates to reduce Type II errors is not straightforward. Historically, researchers often iterated over a large set of available covariates and included only those covariates that increased the effect size of the test of their focal IV (and their chances of obtaining a significant</w:t>
       </w:r>
       <w:r>
         <w:t xml:space="preserve"> </w:t>
@@ -296,16 +288,13 @@
         <w:t xml:space="preserve">p</w:t>
       </w:r>
       <w:r>
-        <w:t xml:space="preserve">-hacking compromises statistical validity, we are left with questions about appropriate covariate selection approaches that both minimize Type II errors and control Type I errors at alpha. Traditionally, researchers have relied on two somewhat extreme strategies for selecting covariates. At one end, the researcher could decide to avoid the use of covariates altogether with no risk to Type I error control. But statistical power would likely be lost by this decision.</w:t>
-      </w:r>
-      <w:r>
-        <w:t xml:space="preserve"> </w:t>
-      </w:r>
-      <w:r>
-        <w:t xml:space="preserve">At the other extreme, the researcher could plan to include all available covariates that are reasonably believed to account for unexplained variance in the outcome in the statistical analysis. This decision, if made a priori</w:t>
-      </w:r>
-      <w:r>
-        <w:t xml:space="preserve">, would also not be expected to inflate the Type I error rate. However, this approach may not yield optimal statistical power because a subset of these covariates may not manifest strong, or any, relationship with the outcome in any particular study if they have not been previously well-established as robust predictors. Furthermore, available covariates are often correlated with each other (e.g., trait anxiety and fearfulness from the previous example), which reduces their potential benefit in reducing noise relative to their cost to degrees of freedom in the analysis.</w:t>
+        <w:t xml:space="preserve">-hacking compromises statistical validity, we are left with questions about appropriate covariate selection approaches</w:t>
+      </w:r>
+      <w:r>
+        <w:t xml:space="preserve"> </w:t>
+      </w:r>
+      <w:r>
+        <w:t xml:space="preserve">that both minimize Type II errors and control Type I errors at alpha. Traditionally, researchers have relied on two somewhat extreme strategies for selecting covariates. At one end, the researcher could decide to avoid the use of covariates altogether with no risk to Type I error control. But this decision would increase the probability of Type II errors due to lower statistical power. At the other extreme, the researcher could plan to include all available covariates that are reasonably believed to account for unexplained variance in the outcome in the statistical analysis. This decision, if made a priori, would also not be expected to inflate the Type I error rate. However, this approach may not yield optimal Type II error rate and statistical power because a subset of these covariates may not manifest strong, or any, relationships with the outcome in any particular study if they have not been previously well-established as robust predictors. Furthermore, available covariates are often correlated with each other (e.g., trait anxiety and fearfulness from the previous example), which reduces their potential benefit in reducing noise relative to their cost to degrees of freedom in the analysis.</w:t>
       </w:r>
     </w:p>
     <w:p>
@@ -343,37 +332,6 @@
         <w:pStyle w:val="BodyText"/>
       </w:pPr>
       <w:r>
-        <w:t xml:space="preserve">To be clear, this paper paper discusses the benefits of using covariates in experimental research where covariates are measured at baseline, prior to manipulation of the IV, and therefore uncorrelated with the IV. In such instances, covariates are a powerful yet simple tool to increase statistical power without adding any complexity to the interpretation of the effect of the IV. However, in some areas of Psychology (e.g., clinical), covariates are routinely used for a different goal - to control for baseline differences across groups when participants were not randomly assigned to groups. In these instances, covariates should be selected using other approaches not considered in this paper (e.g., based on theory and/or putative causal structure among</w:t>
-      </w:r>
-      <w:r>
-        <w:t xml:space="preserve"> </w:t>
-      </w:r>
-      <m:oMath>
-        <m:r>
-          <m:t>X</m:t>
-        </m:r>
-      </m:oMath>
-      <w:r>
-        <w:t xml:space="preserve"> </w:t>
-      </w:r>
-      <w:r>
-        <w:t xml:space="preserve">and covariates). Furthermore, researchers should carefully consider if the interpretative complexity introduced by this alternative use of correlated covariates is warranted and meets their goals</w:t>
-      </w:r>
-      <w:r>
-        <w:t xml:space="preserve"> </w:t>
-      </w:r>
-      <w:r>
-        <w:t xml:space="preserve">(Miller and Chapman 2001)</w:t>
-      </w:r>
-      <w:r>
-        <w:t xml:space="preserve">.</w:t>
-      </w:r>
-    </w:p>
-    <w:p>
-      <w:pPr>
-        <w:pStyle w:val="BodyText"/>
-      </w:pPr>
-      <w:r>
         <w:t xml:space="preserve">In this study, we use simulation methods to evaluate two traditional (</w:t>
       </w:r>
       <w:r>
@@ -404,13 +362,7 @@
         <w:t xml:space="preserve"> </w:t>
       </w:r>
       <w:r>
-        <w:t xml:space="preserve">to identify which covariates display significant relationships with the outcome variable and will be included in the subsequent primary analysis that tests the focal IV</w:t>
-      </w:r>
-      <w:r>
-        <w:t xml:space="preserve">. Across these screening models, we consider</w:t>
-      </w:r>
-      <w:r>
-        <w:t xml:space="preserve"> </w:t>
+        <w:t xml:space="preserve">to determine which covariates to include in the subsequent primary analysis that tests the focal IV. These data-driven approaches include a “</w:t>
       </w:r>
       <w:r>
         <w:rPr>
@@ -420,25 +372,27 @@
         <w:t xml:space="preserve">p</w:t>
       </w:r>
       <w:r>
-        <w:t xml:space="preserve">-hacking (a statistically invalid data-driven approach) and three additional modeling approaches: linear models that screen each covariate separately in its own model (separate cov lm), linear models that screen all covariates simultaneously in a single model (simultaneous cov lm), and LASSO</w:t>
-      </w:r>
-      <w:r>
-        <w:t xml:space="preserve"> </w:t>
+        <w:t xml:space="preserve">-hacking approach and six additional approaches that vary by the modeling approach (i.e., separate linear models vs. simultaneous linear model vs. LASSO</w:t>
       </w:r>
       <w:r>
         <w:t xml:space="preserve">(Tibshirani 1996)</w:t>
       </w:r>
       <w:r>
-        <w:t xml:space="preserve"> </w:t>
-      </w:r>
-      <w:r>
-        <w:t xml:space="preserve">models that screen all covariates simultaneously in a single model (simultaneous cov LASSO). Across the three modeling approaches, we also either exclude or include the focal IV in the screening models. For all approaches we quantify the probability of Type I and Type II errors across a variety of research contexts that vary by sample size, number of available covariates, strength of covariate effects, effect size for the IV and other relevant context characteristics. We use results from these simulations to provide clear and accessible guidance about how best to select an optimal set of covariates to increase statistical power</w:t>
-      </w:r>
-      <w:r>
-        <w:t xml:space="preserve"> </w:t>
-      </w:r>
-      <w:r>
-        <w:t xml:space="preserve">when testing the effect of a manipulated IV in various research contexts.</w:t>
+        <w:t xml:space="preserve">) for the screening model and whether</w:t>
+      </w:r>
+      <w:r>
+        <w:t xml:space="preserve"> </w:t>
+      </w:r>
+      <m:oMath>
+        <m:r>
+          <m:t>X</m:t>
+        </m:r>
+      </m:oMath>
+      <w:r>
+        <w:t xml:space="preserve"> </w:t>
+      </w:r>
+      <w:r>
+        <w:t xml:space="preserve">was included in the screening model. Further detail on these approaches is provided below. For all traditional and data-driven approaches we quantify the probability of Type I and Type II errors across a variety of research contexts that vary by sample size, number of available covariates, strength of covariate effects, effect size for the IV and other relevant context characteristics. We use results from these simulations to provide clear and accessible guidance about how best to select an optimal set of covariates to decrease Type II error rate while controlling Type I error rate when testing the effect of a manipulated IV in various research contexts.</w:t>
       </w:r>
     </w:p>
     <w:bookmarkEnd w:id="20"/>
@@ -465,7 +419,7 @@
         <w:pStyle w:val="FirstParagraph"/>
       </w:pPr>
       <w:r>
-        <w:t xml:space="preserve">As described above, we evaluated two traditional and seven data-driven approaches to select covariates to use in a primary analysis that tested the effect of a focal dichotomous IV (notated as</w:t>
+        <w:t xml:space="preserve">As described earlier, we evaluated two traditional and seven data-driven approaches to select covariates to use in a primary analysis that tested the effect of a focal dichotomous IV (notated as</w:t>
       </w:r>
       <w:r>
         <w:t xml:space="preserve"> </w:t>
@@ -498,7 +452,31 @@
         <w:pStyle w:val="BodyText"/>
       </w:pPr>
       <w:r>
-        <w:t xml:space="preserve">The two traditional selection approaches that did not use the data to screen and select covariates. Instead the no covariates and all covariates approach used none and all of the available covariates, respectively, in the specific research context in the primary analysis of</w:t>
+        <w:t xml:space="preserve">The two traditional selection approaches did not use the data to screen and select covariates. Instead the</w:t>
+      </w:r>
+      <w:r>
+        <w:t xml:space="preserve"> </w:t>
+      </w:r>
+      <w:r>
+        <w:t xml:space="preserve">“no covariates”</w:t>
+      </w:r>
+      <w:r>
+        <w:t xml:space="preserve"> </w:t>
+      </w:r>
+      <w:r>
+        <w:t xml:space="preserve">and</w:t>
+      </w:r>
+      <w:r>
+        <w:t xml:space="preserve"> </w:t>
+      </w:r>
+      <w:r>
+        <w:t xml:space="preserve">“all covariates”</w:t>
+      </w:r>
+      <w:r>
+        <w:t xml:space="preserve"> </w:t>
+      </w:r>
+      <w:r>
+        <w:t xml:space="preserve">approach used none and all of the available covariates, respectively, in the specific research context in the primary analysis of</w:t>
       </w:r>
       <w:r>
         <w:t xml:space="preserve"> </w:t>
@@ -544,7 +522,7 @@
         <w:t xml:space="preserve">p</w:t>
       </w:r>
       <w:r>
-        <w:t xml:space="preserve">-hacking approach, covariates were selected to be included in the primary analysis if the effect of</w:t>
+        <w:t xml:space="preserve">-hacking approach, separate screening models were used for each covariate and covariates were selected to be included in the primary analysis if the effect of</w:t>
       </w:r>
       <w:r>
         <w:t xml:space="preserve"> </w:t>
@@ -558,7 +536,7 @@
         <w:t xml:space="preserve"> </w:t>
       </w:r>
       <w:r>
-        <w:t xml:space="preserve">became larger in the screening model that included that covariate. This replicates the real-world practice of</w:t>
+        <w:t xml:space="preserve">became descriptively larger in the screening model that included that covariate. This approach replicates the real-world practice of</w:t>
       </w:r>
       <w:r>
         <w:t xml:space="preserve"> </w:t>
@@ -571,7 +549,7 @@
         <w:t xml:space="preserve">p</w:t>
       </w:r>
       <w:r>
-        <w:t xml:space="preserve">-hacking where researchers aim to increase the effect size of a focal variable to match a pre-existing hypothesis.</w:t>
+        <w:t xml:space="preserve">-hacking where researchers aim to increase the effect size of a focal variable to match a pre-existing hypothesis. For the remaining six data-driven approaches, covariates were selected to be included in the analysis based on the size or statistical test of the covariate rather than X in the screening model.</w:t>
       </w:r>
     </w:p>
     <w:p>
@@ -579,127 +557,7 @@
         <w:pStyle w:val="BodyText"/>
       </w:pPr>
       <w:r>
-        <w:t xml:space="preserve">We considered three additional modeling approaches: linear models that screen each covariate separately in its own model (separate cov lm)</w:t>
-      </w:r>
-      <w:r>
-        <w:t xml:space="preserve">, linear models that screen all covariates simultaneously in a single model (simultaneous cov lm), and LASSO</w:t>
-      </w:r>
-      <w:r>
-        <w:t xml:space="preserve"> </w:t>
-      </w:r>
-      <w:r>
-        <w:t xml:space="preserve">(Tibshirani 1996)</w:t>
-      </w:r>
-      <w:r>
-        <w:t xml:space="preserve"> </w:t>
-      </w:r>
-      <w:r>
-        <w:t xml:space="preserve">models that screen all covariates simultaneously in a single model (simultaneous cov LASSO). Across these approaches, we also either exclude or include</w:t>
-      </w:r>
-      <w:r>
-        <w:t xml:space="preserve"> </w:t>
-      </w:r>
-      <m:oMath>
-        <m:r>
-          <m:t>X</m:t>
-        </m:r>
-      </m:oMath>
-      <w:r>
-        <w:t xml:space="preserve"> </w:t>
-      </w:r>
-      <w:r>
-        <w:t xml:space="preserve">in the screening models (notated as w/o or with</w:t>
-      </w:r>
-      <w:r>
-        <w:t xml:space="preserve"> </w:t>
-      </w:r>
-      <m:oMath>
-        <m:r>
-          <m:t>X</m:t>
-        </m:r>
-      </m:oMath>
-      <w:r>
-        <w:t xml:space="preserve">). For the simultaneous cov LASSO with</w:t>
-      </w:r>
-      <w:r>
-        <w:t xml:space="preserve"> </w:t>
-      </w:r>
-      <m:oMath>
-        <m:r>
-          <m:t>X</m:t>
-        </m:r>
-      </m:oMath>
-      <w:r>
-        <w:t xml:space="preserve"> </w:t>
-      </w:r>
-      <w:r>
-        <w:t xml:space="preserve">approach, we set the regularization penalty (lambda) for</w:t>
-      </w:r>
-      <w:r>
-        <w:t xml:space="preserve"> </w:t>
-      </w:r>
-      <m:oMath>
-        <m:r>
-          <m:t>X</m:t>
-        </m:r>
-      </m:oMath>
-      <w:r>
-        <w:t xml:space="preserve"> </w:t>
-      </w:r>
-      <w:r>
-        <w:t xml:space="preserve">was to 0 to ensure it was always retained in the screening model.</w:t>
-      </w:r>
-    </w:p>
-    <w:p>
-      <w:pPr>
-        <w:pStyle w:val="BodyText"/>
-      </w:pPr>
-      <w:r>
-        <w:t xml:space="preserve">For the linear models (separate cov lm w/o</w:t>
-      </w:r>
-      <w:r>
-        <w:t xml:space="preserve"> </w:t>
-      </w:r>
-      <m:oMath>
-        <m:r>
-          <m:t>X</m:t>
-        </m:r>
-      </m:oMath>
-      <w:r>
-        <w:t xml:space="preserve">, separate cov lm with</w:t>
-      </w:r>
-      <w:r>
-        <w:t xml:space="preserve"> </w:t>
-      </w:r>
-      <m:oMath>
-        <m:r>
-          <m:t>X</m:t>
-        </m:r>
-      </m:oMath>
-      <w:r>
-        <w:t xml:space="preserve">, simultaneous cov lm w/o</w:t>
-      </w:r>
-      <w:r>
-        <w:t xml:space="preserve"> </w:t>
-      </w:r>
-      <m:oMath>
-        <m:r>
-          <m:t>X</m:t>
-        </m:r>
-      </m:oMath>
-      <w:r>
-        <w:t xml:space="preserve">, and simultaneous cov lm with</w:t>
-      </w:r>
-      <w:r>
-        <w:t xml:space="preserve"> </w:t>
-      </w:r>
-      <m:oMath>
-        <m:r>
-          <m:t>X</m:t>
-        </m:r>
-      </m:oMath>
-      <w:r>
-        <w:t xml:space="preserve">), a covariate was selected to be included in the primary analysis if the</w:t>
+        <w:t xml:space="preserve">The screening models for these remaining six data-driven approaches (excluding</w:t>
       </w:r>
       <w:r>
         <w:t xml:space="preserve"> </w:t>
@@ -712,7 +570,151 @@
         <w:t xml:space="preserve">p</w:t>
       </w:r>
       <w:r>
-        <w:t xml:space="preserve">-value for that covariate was less than 0.05 in the screening model that evaluated it. Importantly, the</w:t>
+        <w:t xml:space="preserve">-hacking) differed across two dimensions. First, we considered three modeling approaches for the screening models: linear models that screened each covariate separately in its own model (</w:t>
+      </w:r>
+      <w:r>
+        <w:t xml:space="preserve">“separate lm”</w:t>
+      </w:r>
+      <w:r>
+        <w:t xml:space="preserve"> </w:t>
+      </w:r>
+      <w:r>
+        <w:t xml:space="preserve">approach), linear models that screened all covariates simultaneously in a single model (</w:t>
+      </w:r>
+      <w:r>
+        <w:t xml:space="preserve">“simultaneous lm”</w:t>
+      </w:r>
+      <w:r>
+        <w:t xml:space="preserve"> </w:t>
+      </w:r>
+      <w:r>
+        <w:t xml:space="preserve">approach), and LASSO</w:t>
+      </w:r>
+      <w:r>
+        <w:t xml:space="preserve"> </w:t>
+      </w:r>
+      <w:r>
+        <w:t xml:space="preserve">(Tibshirani 1996)</w:t>
+      </w:r>
+      <w:r>
+        <w:t xml:space="preserve"> </w:t>
+      </w:r>
+      <w:r>
+        <w:t xml:space="preserve">models that screened all covariates simultaneously in a single model (</w:t>
+      </w:r>
+      <w:r>
+        <w:t xml:space="preserve">“simultaneous LASSO”</w:t>
+      </w:r>
+      <w:r>
+        <w:t xml:space="preserve"> </w:t>
+      </w:r>
+      <w:r>
+        <w:t xml:space="preserve">approach). Across these three approaches, we also either exclude or include</w:t>
+      </w:r>
+      <w:r>
+        <w:t xml:space="preserve"> </w:t>
+      </w:r>
+      <m:oMath>
+        <m:r>
+          <m:t>X</m:t>
+        </m:r>
+      </m:oMath>
+      <w:r>
+        <w:t xml:space="preserve"> </w:t>
+      </w:r>
+      <w:r>
+        <w:t xml:space="preserve">in the screening models (notated as w/o or with</w:t>
+      </w:r>
+      <w:r>
+        <w:t xml:space="preserve"> </w:t>
+      </w:r>
+      <m:oMath>
+        <m:r>
+          <m:t>X</m:t>
+        </m:r>
+      </m:oMath>
+      <w:r>
+        <w:t xml:space="preserve">). For the simultaneous LASSO with</w:t>
+      </w:r>
+      <w:r>
+        <w:t xml:space="preserve"> </w:t>
+      </w:r>
+      <m:oMath>
+        <m:r>
+          <m:t>X</m:t>
+        </m:r>
+      </m:oMath>
+      <w:r>
+        <w:t xml:space="preserve"> </w:t>
+      </w:r>
+      <w:r>
+        <w:t xml:space="preserve">approach, we set the regularization penalty (lambda) for</w:t>
+      </w:r>
+      <w:r>
+        <w:t xml:space="preserve"> </w:t>
+      </w:r>
+      <m:oMath>
+        <m:r>
+          <m:t>X</m:t>
+        </m:r>
+      </m:oMath>
+      <w:r>
+        <w:t xml:space="preserve"> </w:t>
+      </w:r>
+      <w:r>
+        <w:t xml:space="preserve">was to 0 to ensure it was always retained in the screening model.</w:t>
+      </w:r>
+    </w:p>
+    <w:p>
+      <w:pPr>
+        <w:pStyle w:val="BodyText"/>
+      </w:pPr>
+      <w:r>
+        <w:t xml:space="preserve">For the linear models (separate lm w/o</w:t>
+      </w:r>
+      <w:r>
+        <w:t xml:space="preserve"> </w:t>
+      </w:r>
+      <m:oMath>
+        <m:r>
+          <m:t>X</m:t>
+        </m:r>
+      </m:oMath>
+      <w:r>
+        <w:t xml:space="preserve">, separate lm with</w:t>
+      </w:r>
+      <w:r>
+        <w:t xml:space="preserve"> </w:t>
+      </w:r>
+      <m:oMath>
+        <m:r>
+          <m:t>X</m:t>
+        </m:r>
+      </m:oMath>
+      <w:r>
+        <w:t xml:space="preserve">, simultaneous lm w/o</w:t>
+      </w:r>
+      <w:r>
+        <w:t xml:space="preserve"> </w:t>
+      </w:r>
+      <m:oMath>
+        <m:r>
+          <m:t>X</m:t>
+        </m:r>
+      </m:oMath>
+      <w:r>
+        <w:t xml:space="preserve">, and simultaneous lm with</w:t>
+      </w:r>
+      <w:r>
+        <w:t xml:space="preserve"> </w:t>
+      </w:r>
+      <m:oMath>
+        <m:r>
+          <m:t>X</m:t>
+        </m:r>
+      </m:oMath>
+      <w:r>
+        <w:t xml:space="preserve">), a covariate was selected to be included in the primary analysis if the</w:t>
       </w:r>
       <w:r>
         <w:t xml:space="preserve"> </w:t>
@@ -725,6 +727,19 @@
         <w:t xml:space="preserve">p</w:t>
       </w:r>
       <w:r>
+        <w:t xml:space="preserve">-value for that covariate was less than 0.05 in the screening model that evaluated it. Importantly, the size and</w:t>
+      </w:r>
+      <w:r>
+        <w:t xml:space="preserve"> </w:t>
+      </w:r>
+      <w:r>
+        <w:rPr>
+          <w:i/>
+          <w:iCs/>
+        </w:rPr>
+        <w:t xml:space="preserve">p</w:t>
+      </w:r>
+      <w:r>
         <w:t xml:space="preserve">-value for</w:t>
       </w:r>
       <w:r>
@@ -739,7 +754,7 @@
         <w:t xml:space="preserve"> </w:t>
       </w:r>
       <w:r>
-        <w:t xml:space="preserve">was not used and</w:t>
+        <w:t xml:space="preserve">were not used for covariate selection. For the LASSO models (simultaneous LASSO w/o</w:t>
       </w:r>
       <w:r>
         <w:t xml:space="preserve"> </w:t>
@@ -753,35 +768,7 @@
         <w:t xml:space="preserve"> </w:t>
       </w:r>
       <w:r>
-        <w:t xml:space="preserve">was only included to parse its variance from</w:t>
-      </w:r>
-      <w:r>
-        <w:t xml:space="preserve"> </w:t>
-      </w:r>
-      <m:oMath>
-        <m:r>
-          <m:t>Y</m:t>
-        </m:r>
-      </m:oMath>
-      <w:r>
-        <w:t xml:space="preserve"> </w:t>
-      </w:r>
-      <w:r>
-        <w:t xml:space="preserve">when evaluating the covariates. For the LASSO models (simultaneous cov LASSO w/o</w:t>
-      </w:r>
-      <w:r>
-        <w:t xml:space="preserve"> </w:t>
-      </w:r>
-      <m:oMath>
-        <m:r>
-          <m:t>X</m:t>
-        </m:r>
-      </m:oMath>
-      <w:r>
-        <w:t xml:space="preserve"> </w:t>
-      </w:r>
-      <w:r>
-        <w:t xml:space="preserve">and simultaneous cov LASS with</w:t>
+        <w:t xml:space="preserve">and simultaneous LASSO with</w:t>
       </w:r>
       <w:r>
         <w:t xml:space="preserve"> </w:t>
@@ -1029,7 +1016,7 @@
                     <w:jc w:val="center"/>
                   </w:pPr>
                   <w:r>
-                    <w:t xml:space="preserve">Separate cov lm w/o X</w:t>
+                    <w:t xml:space="preserve">Separate lm w/o X</w:t>
                   </w:r>
                 </w:p>
               </w:tc>
@@ -1088,7 +1075,7 @@
                     <w:jc w:val="center"/>
                   </w:pPr>
                   <w:r>
-                    <w:t xml:space="preserve">Separate cov lm with X</w:t>
+                    <w:t xml:space="preserve">Separate lm with X</w:t>
                   </w:r>
                 </w:p>
               </w:tc>
@@ -1147,7 +1134,7 @@
                     <w:jc w:val="center"/>
                   </w:pPr>
                   <w:r>
-                    <w:t xml:space="preserve">Simultaneous cov lm w/o X</w:t>
+                    <w:t xml:space="preserve">Simultaneous lm w/o X</w:t>
                   </w:r>
                 </w:p>
               </w:tc>
@@ -1188,7 +1175,7 @@
                     <w:jc w:val="center"/>
                   </w:pPr>
                   <w:r>
-                    <w:t xml:space="preserve">Simultaneous cov lm with X</w:t>
+                    <w:t xml:space="preserve">Simultaneous lm with X</w:t>
                   </w:r>
                 </w:p>
               </w:tc>
@@ -1229,7 +1216,7 @@
                     <w:jc w:val="center"/>
                   </w:pPr>
                   <w:r>
-                    <w:t xml:space="preserve">Simultaneous cov LASSO w/o X</w:t>
+                    <w:t xml:space="preserve">Simultaneous LASSO w/o X</w:t>
                   </w:r>
                 </w:p>
               </w:tc>
@@ -1270,7 +1257,7 @@
                     <w:jc w:val="center"/>
                   </w:pPr>
                   <w:r>
-                    <w:t xml:space="preserve">Simultaneous cov LASSO with X</w:t>
+                    <w:t xml:space="preserve">Simultaneous LASSO with X</w:t>
                   </w:r>
                 </w:p>
               </w:tc>
@@ -3207,7 +3194,7 @@
         <w:pStyle w:val="FirstParagraph"/>
       </w:pPr>
       <w:r>
-        <w:t xml:space="preserve">When the assumptions of the linear model are met, parameter estimates are unbiased (i.e. the mean of the parameter estimate’s sampling distribution equals the value of the population parameter) and their sampling distributions follow the t-distribution. To evaluate the impact of the screening approaches on the parameter estimate (i.e.,</w:t>
+        <w:t xml:space="preserve">When the assumptions of the linear model are met, parameter estimates are unbiased (i.e. the mean of the parameter estimate’s sampling distribution equals the value of the population parameter) and their sampling distributions follow the t-distribution. To evaluate the impact of the covariate selection approaches on the parameter estimate (i.e.,</w:t>
       </w:r>
       <w:r>
         <w:t xml:space="preserve"> </w:t>
@@ -3705,7 +3692,7 @@
                     <w:jc w:val="center"/>
                   </w:pPr>
                   <w:r>
-                    <w:t xml:space="preserve">Separate cov lm w/o X</w:t>
+                    <w:t xml:space="preserve">Separate lm w/o X</w:t>
                   </w:r>
                 </w:p>
               </w:tc>
@@ -3759,7 +3746,7 @@
                     <w:jc w:val="center"/>
                   </w:pPr>
                   <w:r>
-                    <w:t xml:space="preserve">Separate cov lm with X</w:t>
+                    <w:t xml:space="preserve">Separate lm with X</w:t>
                   </w:r>
                 </w:p>
               </w:tc>
@@ -3813,7 +3800,7 @@
                     <w:jc w:val="center"/>
                   </w:pPr>
                   <w:r>
-                    <w:t xml:space="preserve">Simultaneous cov lm w/o X</w:t>
+                    <w:t xml:space="preserve">Simultaneous lm w/o X</w:t>
                   </w:r>
                 </w:p>
               </w:tc>
@@ -3867,7 +3854,7 @@
                     <w:jc w:val="center"/>
                   </w:pPr>
                   <w:r>
-                    <w:t xml:space="preserve">Simultaneous cov lm with X</w:t>
+                    <w:t xml:space="preserve">Simultaneous lm with X</w:t>
                   </w:r>
                 </w:p>
               </w:tc>
@@ -3921,7 +3908,7 @@
                     <w:jc w:val="center"/>
                   </w:pPr>
                   <w:r>
-                    <w:t xml:space="preserve">Simultaneous cov LASSO w/o X</w:t>
+                    <w:t xml:space="preserve">Simultaneous LASSO w/o X</w:t>
                   </w:r>
                 </w:p>
               </w:tc>
@@ -3975,7 +3962,7 @@
                     <w:jc w:val="center"/>
                   </w:pPr>
                   <w:r>
-                    <w:t xml:space="preserve">Simultaneous cov LASSO with X</w:t>
+                    <w:t xml:space="preserve">Simultaneous LASSO with X</w:t>
                   </w:r>
                 </w:p>
               </w:tc>
@@ -4229,7 +4216,7 @@
         <w:t xml:space="preserve">p</w:t>
       </w:r>
       <w:r>
-        <w:t xml:space="preserve">-hacking approach yielded substantial optimistic (over-estimation) bias in the parameter estimates as seen in both the mean</w:t>
+        <w:t xml:space="preserve">-hacking approach yielded substantial optimistic (over-estimation) bias in the magnitude of the parameter estimates as seen in both the mean</w:t>
       </w:r>
       <w:r>
         <w:t xml:space="preserve"> </w:t>
@@ -4917,56 +4904,7 @@
         <w:t xml:space="preserve">p</w:t>
       </w:r>
       <w:r>
-        <w:t xml:space="preserve">-hacking reached 0.289 in the worst case context (</w:t>
-      </w:r>
-      <m:oMath>
-        <m:r>
-          <m:t>N</m:t>
-        </m:r>
-      </m:oMath>
-      <w:r>
-        <w:t xml:space="preserve"> </w:t>
-      </w:r>
-      <w:r>
-        <w:t xml:space="preserve">= 50, 20 available covariates with</w:t>
-      </w:r>
-      <w:r>
-        <w:t xml:space="preserve"> </w:t>
-      </w:r>
-      <m:oMath>
-        <m:sSub>
-          <m:e>
-            <m:r>
-              <m:t>r</m:t>
-            </m:r>
-          </m:e>
-          <m:sub>
-            <m:r>
-              <m:t>c</m:t>
-            </m:r>
-            <m:r>
-              <m:t>o</m:t>
-            </m:r>
-            <m:r>
-              <m:t>v</m:t>
-            </m:r>
-            <m:r>
-              <m:rPr>
-                <m:sty m:val="p"/>
-              </m:rPr>
-              <m:t>−</m:t>
-            </m:r>
-            <m:r>
-              <m:t>Y</m:t>
-            </m:r>
-          </m:sub>
-        </m:sSub>
-      </m:oMath>
-      <w:r>
-        <w:t xml:space="preserve"> </w:t>
-      </w:r>
-      <w:r>
-        <w:t xml:space="preserve">= 0.5 for 75% of the covariate set; see Shiny dashboard for other contexts).</w:t>
+        <w:t xml:space="preserve">-hacking reached 0.298 in the worst case context (see Shiny dashboard for error rates in all contexts).</w:t>
       </w:r>
     </w:p>
     <w:p>
@@ -5303,7 +5241,7 @@
         </m:r>
       </m:oMath>
       <w:r>
-        <w:t xml:space="preserve">). Given that we set the standard deviation of</w:t>
+        <w:t xml:space="preserve">). Given that we set the pooled standard deviation of</w:t>
       </w:r>
       <w:r>
         <w:t xml:space="preserve"> </w:t>
@@ -5763,7 +5701,7 @@
         <w:t xml:space="preserve">p</w:t>
       </w:r>
       <w:r>
-        <w:t xml:space="preserve">-hacking problem in common research contexts. In some research contexts, Type I error rates approached 0.298 (range: 0.051-0.298). Additionally,</w:t>
+        <w:t xml:space="preserve">-hacking problem in common research contexts. In some research contexts, Type I error rates reached up to 0.298 (range: 0.051-0.298). Additionally,</w:t>
       </w:r>
       <w:r>
         <w:t xml:space="preserve"> </w:t>
@@ -5943,7 +5881,7 @@
         <w:t xml:space="preserve"> </w:t>
       </w:r>
       <w:r>
-        <w:t xml:space="preserve">) and it may never be wise to give up any improvements in power, even if modest. Moreover, the relative benefits of the best data-driven approaches are more substantial in some specific research contexts (e.g., small</w:t>
+        <w:t xml:space="preserve">) and it may never be wise to give up any reduction in Type II error rate, even if modest. Moreover, the relative benefits of the best data-driven approaches are more substantial in some specific research contexts (e.g., small</w:t>
       </w:r>
       <w:r>
         <w:t xml:space="preserve"> </w:t>
@@ -6072,7 +6010,7 @@
         </m:sSub>
       </m:oMath>
       <w:r>
-        <w:t xml:space="preserve">=0.5), the Type II error rate for the simultaneous cov LASSO with</w:t>
+        <w:t xml:space="preserve">=0.5), the Type II error rate for the simultaneous LASSO with</w:t>
       </w:r>
       <w:r>
         <w:t xml:space="preserve"> </w:t>
@@ -6086,7 +6024,7 @@
         <w:t xml:space="preserve"> </w:t>
       </w:r>
       <w:r>
-        <w:t xml:space="preserve">approach was 0.204 lower than the all covariates approach!</w:t>
+        <w:t xml:space="preserve">approach was 0.203 lower than the all covariates approach!</w:t>
       </w:r>
     </w:p>
     <w:p>
@@ -6094,7 +6032,7 @@
         <w:pStyle w:val="BodyText"/>
       </w:pPr>
       <w:r>
-        <w:t xml:space="preserve">There are several issues to consider when comparing among the several top data-driven approaches. The approach with the lowest mean Type II error rate (0.337) was the simultaneous cov LASSO with</w:t>
+        <w:t xml:space="preserve">There are several issues to consider when comparing among the several top data-driven approaches. The approach with the lowest mean Type II error rate (0.337) was the simultaneous LASSO with</w:t>
       </w:r>
       <w:r>
         <w:t xml:space="preserve"> </w:t>
@@ -6125,7 +6063,7 @@
         </m:sSub>
       </m:oMath>
       <w:r>
-        <w:t xml:space="preserve">. However, it had a slightly inflated Type I error rate (0.057) and the implementation of LASSO may be less familiar to some researchers (but see example code on OSF to implement it). Screening with separate cov lm with</w:t>
+        <w:t xml:space="preserve">. However, it had a slightly inflated Type I error rate (0.057) and the implementation of LASSO may be less familiar to some researchers (but see example code on OSF to implement it). Screening with separate lm with</w:t>
       </w:r>
       <w:r>
         <w:t xml:space="preserve"> </w:t>
@@ -6139,7 +6077,21 @@
         <w:t xml:space="preserve"> </w:t>
       </w:r>
       <w:r>
-        <w:t xml:space="preserve">may feel easier, or more familiar to some researchers. This method yielded an unbiased estimate of</w:t>
+        <w:t xml:space="preserve">may feel easier, or more familiar to some researchers. When compared to the LASSO with</w:t>
+      </w:r>
+      <w:r>
+        <w:t xml:space="preserve"> </w:t>
+      </w:r>
+      <m:oMath>
+        <m:r>
+          <m:t>X</m:t>
+        </m:r>
+      </m:oMath>
+      <w:r>
+        <w:t xml:space="preserve"> </w:t>
+      </w:r>
+      <w:r>
+        <w:t xml:space="preserve">approach, the separate lm approach also yielded an unbiased estimate of</w:t>
       </w:r>
       <w:r>
         <w:t xml:space="preserve"> </w:t>
@@ -6162,18 +6114,7 @@
         <w:t xml:space="preserve"> </w:t>
       </w:r>
       <w:r>
-        <w:t xml:space="preserve">with slightly worse Type II error rate (0.341) but better Type I error rate (0.052) than simultaneous cov LASSO with</w:t>
-      </w:r>
-      <w:r>
-        <w:t xml:space="preserve"> </w:t>
-      </w:r>
-      <m:oMath>
-        <m:r>
-          <m:t>X</m:t>
-        </m:r>
-      </m:oMath>
-      <w:r>
-        <w:t xml:space="preserve">. Finally, if perfect control of Type I error rate at the nominal alpha is desired, screening with separate cov lm w/o</w:t>
+        <w:t xml:space="preserve">and a better Type I error rate (0.052) but with slightly worse Type II error rate (0.341). Finally, if perfect control of Type I error rate at the nominal alpha is desired, screening with separate lm w/o</w:t>
       </w:r>
       <w:r>
         <w:t xml:space="preserve"> </w:t>
@@ -6207,7 +6148,7 @@
         </m:sSub>
       </m:oMath>
       <w:r>
-        <w:t xml:space="preserve">, and further increased mean Type II error rate (0.347) than the previous two approaches.</w:t>
+        <w:t xml:space="preserve">, and further increased mean Type II error rate (0.347) than the two previously discussed approaches.</w:t>
       </w:r>
     </w:p>
     <w:p>
@@ -6302,20 +6243,66 @@
         <w:pStyle w:val="BodyText"/>
       </w:pPr>
       <w:r>
-        <w:t xml:space="preserve">We believe our paper provides strong evidence to support the clear benefits of using covariates. We hope that we have also clarified the relative costs and benefits of key approaches to selecting them in experimental research. To help researchers determine which covariate selection is best suited for their research context, we provide a summary of our recommendations in</w:t>
-      </w:r>
-      <w:r>
-        <w:t xml:space="preserve"> </w:t>
-      </w:r>
-      <w:r>
-        <w:rPr>
-          <w:b/>
-          <w:bCs/>
-        </w:rPr>
-        <w:t xml:space="preserve">?@tbl-rec</w:t>
+        <w:t xml:space="preserve">Finally, this simulation study evaluated the benefits of using covariates in experimental research where covariates are measured at baseline, prior to manipulation of the IV, and therefore uncorrelated with the IV. In such instances, covariates are a powerful yet simple tool to increase statistical power without adding any complexity to the interpretation of the effect of the IV. However, in some areas of Psychology (e.g., clinical), covariates are routinely used for a different goal - to control for baseline differences across groups when participants were not randomly assigned to groups. In these instances, covariates should be selected using other approaches not considered in this paper (e.g., based on theory and/or putative causal structure among</w:t>
+      </w:r>
+      <w:r>
+        <w:t xml:space="preserve"> </w:t>
+      </w:r>
+      <m:oMath>
+        <m:r>
+          <m:t>X</m:t>
+        </m:r>
+      </m:oMath>
+      <w:r>
+        <w:t xml:space="preserve"> </w:t>
+      </w:r>
+      <w:r>
+        <w:t xml:space="preserve">and covariates). Furthermore, researchers should carefully consider if the interpretative complexity introduced by this alternative use of correlated covariates is warranted and meets their goals</w:t>
+      </w:r>
+      <w:r>
+        <w:t xml:space="preserve"> </w:t>
+      </w:r>
+      <w:r>
+        <w:t xml:space="preserve">(Miller and Chapman 2001)</w:t>
       </w:r>
       <w:r>
         <w:t xml:space="preserve">.</w:t>
+      </w:r>
+    </w:p>
+    <w:p>
+      <w:pPr>
+        <w:pStyle w:val="BodyText"/>
+      </w:pPr>
+      <w:r>
+        <w:t xml:space="preserve">We believe our paper provides strong evidence to support the clear benefits of using baseline covariates. In our opinion, we believe that either the simultaneous LASSO with</w:t>
+      </w:r>
+      <w:r>
+        <w:t xml:space="preserve"> </w:t>
+      </w:r>
+      <m:oMath>
+        <m:r>
+          <m:t>X</m:t>
+        </m:r>
+      </m:oMath>
+      <w:r>
+        <w:t xml:space="preserve"> </w:t>
+      </w:r>
+      <w:r>
+        <w:t xml:space="preserve">or the separate lm with</w:t>
+      </w:r>
+      <w:r>
+        <w:t xml:space="preserve"> </w:t>
+      </w:r>
+      <m:oMath>
+        <m:r>
+          <m:t>X</m:t>
+        </m:r>
+      </m:oMath>
+      <w:r>
+        <w:t xml:space="preserve"> </w:t>
+      </w:r>
+      <w:r>
+        <w:t xml:space="preserve">are the superior choices when considering both Type I/II error rates and parameter estimate bias. However, we also hope that we have also clarified the relative costs and benefits across all of these approaches to allow researchers to make informed decisions based on their own priorities and research context.</w:t>
       </w:r>
     </w:p>
     <w:bookmarkEnd w:id="63"/>
@@ -6333,7 +6320,7 @@
         <w:pStyle w:val="FirstParagraph"/>
       </w:pPr>
       <w:r>
-        <w:t xml:space="preserve">The authors wish to thank Christopher Janssen for his role in developing the interactive shiny dashboard available on our OSF page.</w:t>
+        <w:t xml:space="preserve">The authors thank Christopher Janssen for developing the interactive shiny dashboard on our OSF page.</w:t>
       </w:r>
     </w:p>
     <w:bookmarkEnd w:id="64"/>

</xml_diff>